<commit_message>
Adding Clase practica 11 y ultima actualizacion y correccion al documento de informe final de auditoria de sistemas
</commit_message>
<xml_diff>
--- a/Tareas realizadas Word/CLASE PRÁCTICA No. 11.docx
+++ b/Tareas realizadas Word/CLASE PRÁCTICA No. 11.docx
@@ -811,7 +811,6 @@
       <w:tblPr>
         <w:tblStyle w:val="GridTable2Accent5"/>
         <w:tblW w:w="9781" w:type="dxa"/>
-        <w:tblInd w:w="0" w:type="dxa"/>
         <w:tblLook w:val="04A0" w:firstRow="1" w:lastRow="0" w:firstColumn="1" w:lastColumn="0" w:noHBand="0" w:noVBand="1"/>
       </w:tblPr>
       <w:tblGrid>
@@ -828,9 +827,7 @@
             <w:cnfStyle w:val="001000000000" w:firstRow="0" w:lastRow="0" w:firstColumn="1" w:lastColumn="0" w:oddVBand="0" w:evenVBand="0" w:oddHBand="0" w:evenHBand="0" w:firstRowFirstColumn="0" w:firstRowLastColumn="0" w:lastRowFirstColumn="0" w:lastRowLastColumn="0"/>
             <w:tcW w:w="0" w:type="auto"/>
             <w:tcBorders>
-              <w:top w:val="nil"/>
               <w:left w:val="nil"/>
-              <w:right w:val="nil"/>
             </w:tcBorders>
             <w:shd w:val="clear" w:color="auto" w:fill="92CDDC" w:themeFill="accent5" w:themeFillTint="99"/>
             <w:hideMark/>
@@ -858,11 +855,6 @@
         <w:tc>
           <w:tcPr>
             <w:tcW w:w="4302" w:type="dxa"/>
-            <w:tcBorders>
-              <w:top w:val="nil"/>
-              <w:left w:val="nil"/>
-              <w:right w:val="nil"/>
-            </w:tcBorders>
             <w:shd w:val="clear" w:color="auto" w:fill="92CDDC" w:themeFill="accent5" w:themeFillTint="99"/>
             <w:hideMark/>
           </w:tcPr>
@@ -911,8 +903,6 @@
           <w:tcPr>
             <w:tcW w:w="4830" w:type="dxa"/>
             <w:tcBorders>
-              <w:top w:val="nil"/>
-              <w:left w:val="nil"/>
               <w:right w:val="nil"/>
             </w:tcBorders>
             <w:shd w:val="clear" w:color="auto" w:fill="92CDDC" w:themeFill="accent5" w:themeFillTint="99"/>
@@ -4431,8 +4421,6 @@
           <w:szCs w:val="24"/>
         </w:rPr>
       </w:pPr>
-      <w:bookmarkStart w:id="0" w:name="_GoBack"/>
-      <w:bookmarkEnd w:id="0"/>
       <w:r>
         <w:rPr>
           <w:rFonts w:ascii="Courier New" w:eastAsia="Times New Roman" w:hAnsi="Courier New" w:cs="Courier New"/>
@@ -5975,7 +5963,7 @@
         </w:rPr>
         <w:lastRenderedPageBreak/>
         <w:pict>
-          <v:rect id="_x0000_i1047" style="width:0;height:.75pt" o:hralign="center" o:hrstd="t" o:hr="t" fillcolor="#a0a0a0" stroked="f"/>
+          <v:rect id="_x0000_i1025" style="width:0;height:.75pt" o:hralign="center" o:hrstd="t" o:hr="t" fillcolor="#a0a0a0" stroked="f"/>
         </w:pict>
       </w:r>
     </w:p>
@@ -12566,6 +12554,2172 @@
         <w:spacing w:before="100" w:beforeAutospacing="1" w:after="100" w:afterAutospacing="1" w:line="240" w:lineRule="auto"/>
       </w:pPr>
     </w:p>
+    <w:p>
+      <w:r>
+        <w:br w:type="page"/>
+      </w:r>
+    </w:p>
+    <w:p>
+      <w:pPr>
+        <w:pStyle w:val="Ttulo1"/>
+        <w:rPr>
+          <w:rFonts w:ascii="Courier New" w:hAnsi="Courier New" w:cs="Courier New"/>
+          <w:color w:val="0070C0"/>
+          <w:sz w:val="36"/>
+          <w:szCs w:val="36"/>
+          <w:lang w:val="es-ES"/>
+        </w:rPr>
+      </w:pPr>
+      <w:r>
+        <w:rPr>
+          <w:rFonts w:ascii="Courier New" w:hAnsi="Courier New" w:cs="Courier New"/>
+          <w:color w:val="0070C0"/>
+          <w:sz w:val="36"/>
+          <w:szCs w:val="36"/>
+          <w:lang w:val="es-ES"/>
+        </w:rPr>
+        <w:lastRenderedPageBreak/>
+        <w:t>VIII. ACTIVIDAD 6. INTEGRACIÓN CON COSO</w:t>
+      </w:r>
+    </w:p>
+    <w:p>
+      <w:pPr>
+        <w:pStyle w:val="isselectedend"/>
+        <w:rPr>
+          <w:rFonts w:ascii="Courier New" w:hAnsi="Courier New" w:cs="Courier New"/>
+          <w:lang w:val="es-ES"/>
+        </w:rPr>
+      </w:pPr>
+      <w:r>
+        <w:rPr>
+          <w:rFonts w:ascii="Courier New" w:hAnsi="Courier New" w:cs="Courier New"/>
+          <w:lang w:val="es-ES"/>
+        </w:rPr>
+        <w:t>Relacione los hallazgos encontrados con los componentes del modelo COSO.</w:t>
+      </w:r>
+    </w:p>
+    <w:tbl>
+      <w:tblPr>
+        <w:tblStyle w:val="GridTable4Accent5"/>
+        <w:tblW w:w="9776" w:type="dxa"/>
+        <w:tblLook w:val="04A0" w:firstRow="1" w:lastRow="0" w:firstColumn="1" w:lastColumn="0" w:noHBand="0" w:noVBand="1"/>
+      </w:tblPr>
+      <w:tblGrid>
+        <w:gridCol w:w="5240"/>
+        <w:gridCol w:w="4536"/>
+      </w:tblGrid>
+      <w:tr>
+        <w:trPr>
+          <w:cnfStyle w:val="100000000000" w:firstRow="1" w:lastRow="0" w:firstColumn="0" w:lastColumn="0" w:oddVBand="0" w:evenVBand="0" w:oddHBand="0" w:evenHBand="0" w:firstRowFirstColumn="0" w:firstRowLastColumn="0" w:lastRowFirstColumn="0" w:lastRowLastColumn="0"/>
+        </w:trPr>
+        <w:tc>
+          <w:tcPr>
+            <w:cnfStyle w:val="001000000000" w:firstRow="0" w:lastRow="0" w:firstColumn="1" w:lastColumn="0" w:oddVBand="0" w:evenVBand="0" w:oddHBand="0" w:evenHBand="0" w:firstRowFirstColumn="0" w:firstRowLastColumn="0" w:lastRowFirstColumn="0" w:lastRowLastColumn="0"/>
+            <w:tcW w:w="5240" w:type="dxa"/>
+            <w:tcBorders>
+              <w:right w:val="nil"/>
+            </w:tcBorders>
+            <w:shd w:val="clear" w:color="auto" w:fill="00FFCC"/>
+            <w:hideMark/>
+          </w:tcPr>
+          <w:p>
+            <w:pPr>
+              <w:rPr>
+                <w:rFonts w:ascii="Courier New" w:hAnsi="Courier New" w:cs="Courier New"/>
+                <w:color w:val="002060"/>
+                <w:lang w:val="es-ES"/>
+              </w:rPr>
+            </w:pPr>
+            <w:proofErr w:type="spellStart"/>
+            <w:r>
+              <w:rPr>
+                <w:rFonts w:ascii="Courier New" w:hAnsi="Courier New" w:cs="Courier New"/>
+                <w:color w:val="002060"/>
+              </w:rPr>
+              <w:t>Hallazgo</w:t>
+            </w:r>
+            <w:proofErr w:type="spellEnd"/>
+          </w:p>
+        </w:tc>
+        <w:tc>
+          <w:tcPr>
+            <w:tcW w:w="4536" w:type="dxa"/>
+            <w:tcBorders>
+              <w:left w:val="nil"/>
+            </w:tcBorders>
+            <w:shd w:val="clear" w:color="auto" w:fill="00FFCC"/>
+            <w:hideMark/>
+          </w:tcPr>
+          <w:p>
+            <w:pPr>
+              <w:cnfStyle w:val="100000000000" w:firstRow="1" w:lastRow="0" w:firstColumn="0" w:lastColumn="0" w:oddVBand="0" w:evenVBand="0" w:oddHBand="0" w:evenHBand="0" w:firstRowFirstColumn="0" w:firstRowLastColumn="0" w:lastRowFirstColumn="0" w:lastRowLastColumn="0"/>
+              <w:rPr>
+                <w:rFonts w:ascii="Courier New" w:hAnsi="Courier New" w:cs="Courier New"/>
+                <w:color w:val="002060"/>
+                <w:lang w:val="es-ES"/>
+              </w:rPr>
+            </w:pPr>
+            <w:proofErr w:type="spellStart"/>
+            <w:r>
+              <w:rPr>
+                <w:rFonts w:ascii="Courier New" w:hAnsi="Courier New" w:cs="Courier New"/>
+                <w:color w:val="002060"/>
+              </w:rPr>
+              <w:t>Componente</w:t>
+            </w:r>
+            <w:proofErr w:type="spellEnd"/>
+            <w:r>
+              <w:rPr>
+                <w:rFonts w:ascii="Courier New" w:hAnsi="Courier New" w:cs="Courier New"/>
+                <w:color w:val="002060"/>
+              </w:rPr>
+              <w:t xml:space="preserve"> COSO</w:t>
+            </w:r>
+          </w:p>
+        </w:tc>
+      </w:tr>
+      <w:tr>
+        <w:trPr>
+          <w:cnfStyle w:val="000000100000" w:firstRow="0" w:lastRow="0" w:firstColumn="0" w:lastColumn="0" w:oddVBand="0" w:evenVBand="0" w:oddHBand="1" w:evenHBand="0" w:firstRowFirstColumn="0" w:firstRowLastColumn="0" w:lastRowFirstColumn="0" w:lastRowLastColumn="0"/>
+        </w:trPr>
+        <w:tc>
+          <w:tcPr>
+            <w:cnfStyle w:val="001000000000" w:firstRow="0" w:lastRow="0" w:firstColumn="1" w:lastColumn="0" w:oddVBand="0" w:evenVBand="0" w:oddHBand="0" w:evenHBand="0" w:firstRowFirstColumn="0" w:firstRowLastColumn="0" w:lastRowFirstColumn="0" w:lastRowLastColumn="0"/>
+            <w:tcW w:w="5240" w:type="dxa"/>
+            <w:tcBorders>
+              <w:top w:val="single" w:sz="4" w:space="0" w:color="92CDDC" w:themeColor="accent5" w:themeTint="99"/>
+              <w:left w:val="single" w:sz="4" w:space="0" w:color="92CDDC" w:themeColor="accent5" w:themeTint="99"/>
+              <w:bottom w:val="single" w:sz="4" w:space="0" w:color="92CDDC" w:themeColor="accent5" w:themeTint="99"/>
+              <w:right w:val="single" w:sz="4" w:space="0" w:color="92CDDC" w:themeColor="accent5" w:themeTint="99"/>
+            </w:tcBorders>
+            <w:hideMark/>
+          </w:tcPr>
+          <w:p>
+            <w:pPr>
+              <w:rPr>
+                <w:lang w:val="es-US"/>
+              </w:rPr>
+            </w:pPr>
+            <w:r>
+              <w:rPr>
+                <w:lang w:val="es-US"/>
+              </w:rPr>
+              <w:t>Falta de respaldo de información</w:t>
+            </w:r>
+          </w:p>
+        </w:tc>
+        <w:tc>
+          <w:tcPr>
+            <w:tcW w:w="4536" w:type="dxa"/>
+            <w:tcBorders>
+              <w:top w:val="single" w:sz="4" w:space="0" w:color="92CDDC" w:themeColor="accent5" w:themeTint="99"/>
+              <w:left w:val="single" w:sz="4" w:space="0" w:color="92CDDC" w:themeColor="accent5" w:themeTint="99"/>
+              <w:bottom w:val="single" w:sz="4" w:space="0" w:color="92CDDC" w:themeColor="accent5" w:themeTint="99"/>
+              <w:right w:val="single" w:sz="4" w:space="0" w:color="92CDDC" w:themeColor="accent5" w:themeTint="99"/>
+            </w:tcBorders>
+            <w:hideMark/>
+          </w:tcPr>
+          <w:p>
+            <w:pPr>
+              <w:cnfStyle w:val="000000100000" w:firstRow="0" w:lastRow="0" w:firstColumn="0" w:lastColumn="0" w:oddVBand="0" w:evenVBand="0" w:oddHBand="1" w:evenHBand="0" w:firstRowFirstColumn="0" w:firstRowLastColumn="0" w:lastRowFirstColumn="0" w:lastRowLastColumn="0"/>
+            </w:pPr>
+            <w:proofErr w:type="spellStart"/>
+            <w:r>
+              <w:t>Actividades</w:t>
+            </w:r>
+            <w:proofErr w:type="spellEnd"/>
+            <w:r>
+              <w:t xml:space="preserve"> de Control</w:t>
+            </w:r>
+          </w:p>
+        </w:tc>
+      </w:tr>
+      <w:tr>
+        <w:tc>
+          <w:tcPr>
+            <w:cnfStyle w:val="001000000000" w:firstRow="0" w:lastRow="0" w:firstColumn="1" w:lastColumn="0" w:oddVBand="0" w:evenVBand="0" w:oddHBand="0" w:evenHBand="0" w:firstRowFirstColumn="0" w:firstRowLastColumn="0" w:lastRowFirstColumn="0" w:lastRowLastColumn="0"/>
+            <w:tcW w:w="5240" w:type="dxa"/>
+            <w:tcBorders>
+              <w:top w:val="single" w:sz="4" w:space="0" w:color="92CDDC" w:themeColor="accent5" w:themeTint="99"/>
+              <w:left w:val="single" w:sz="4" w:space="0" w:color="92CDDC" w:themeColor="accent5" w:themeTint="99"/>
+              <w:bottom w:val="single" w:sz="4" w:space="0" w:color="92CDDC" w:themeColor="accent5" w:themeTint="99"/>
+              <w:right w:val="single" w:sz="4" w:space="0" w:color="92CDDC" w:themeColor="accent5" w:themeTint="99"/>
+            </w:tcBorders>
+            <w:hideMark/>
+          </w:tcPr>
+          <w:p>
+            <w:proofErr w:type="spellStart"/>
+            <w:r>
+              <w:t>Accesos</w:t>
+            </w:r>
+            <w:proofErr w:type="spellEnd"/>
+            <w:r>
+              <w:t xml:space="preserve"> </w:t>
+            </w:r>
+            <w:proofErr w:type="spellStart"/>
+            <w:r>
+              <w:t>compartidos</w:t>
+            </w:r>
+            <w:proofErr w:type="spellEnd"/>
+          </w:p>
+        </w:tc>
+        <w:tc>
+          <w:tcPr>
+            <w:tcW w:w="4536" w:type="dxa"/>
+            <w:tcBorders>
+              <w:top w:val="single" w:sz="4" w:space="0" w:color="92CDDC" w:themeColor="accent5" w:themeTint="99"/>
+              <w:left w:val="single" w:sz="4" w:space="0" w:color="92CDDC" w:themeColor="accent5" w:themeTint="99"/>
+              <w:bottom w:val="single" w:sz="4" w:space="0" w:color="92CDDC" w:themeColor="accent5" w:themeTint="99"/>
+              <w:right w:val="single" w:sz="4" w:space="0" w:color="92CDDC" w:themeColor="accent5" w:themeTint="99"/>
+            </w:tcBorders>
+            <w:hideMark/>
+          </w:tcPr>
+          <w:p>
+            <w:pPr>
+              <w:cnfStyle w:val="000000000000" w:firstRow="0" w:lastRow="0" w:firstColumn="0" w:lastColumn="0" w:oddVBand="0" w:evenVBand="0" w:oddHBand="0" w:evenHBand="0" w:firstRowFirstColumn="0" w:firstRowLastColumn="0" w:lastRowFirstColumn="0" w:lastRowLastColumn="0"/>
+            </w:pPr>
+            <w:proofErr w:type="spellStart"/>
+            <w:r>
+              <w:t>Entorno</w:t>
+            </w:r>
+            <w:proofErr w:type="spellEnd"/>
+            <w:r>
+              <w:t xml:space="preserve"> de Control</w:t>
+            </w:r>
+          </w:p>
+        </w:tc>
+      </w:tr>
+      <w:tr>
+        <w:trPr>
+          <w:cnfStyle w:val="000000100000" w:firstRow="0" w:lastRow="0" w:firstColumn="0" w:lastColumn="0" w:oddVBand="0" w:evenVBand="0" w:oddHBand="1" w:evenHBand="0" w:firstRowFirstColumn="0" w:firstRowLastColumn="0" w:lastRowFirstColumn="0" w:lastRowLastColumn="0"/>
+        </w:trPr>
+        <w:tc>
+          <w:tcPr>
+            <w:cnfStyle w:val="001000000000" w:firstRow="0" w:lastRow="0" w:firstColumn="1" w:lastColumn="0" w:oddVBand="0" w:evenVBand="0" w:oddHBand="0" w:evenHBand="0" w:firstRowFirstColumn="0" w:firstRowLastColumn="0" w:lastRowFirstColumn="0" w:lastRowLastColumn="0"/>
+            <w:tcW w:w="5240" w:type="dxa"/>
+            <w:tcBorders>
+              <w:top w:val="single" w:sz="4" w:space="0" w:color="92CDDC" w:themeColor="accent5" w:themeTint="99"/>
+              <w:left w:val="single" w:sz="4" w:space="0" w:color="92CDDC" w:themeColor="accent5" w:themeTint="99"/>
+              <w:bottom w:val="single" w:sz="4" w:space="0" w:color="92CDDC" w:themeColor="accent5" w:themeTint="99"/>
+              <w:right w:val="single" w:sz="4" w:space="0" w:color="92CDDC" w:themeColor="accent5" w:themeTint="99"/>
+            </w:tcBorders>
+            <w:hideMark/>
+          </w:tcPr>
+          <w:p>
+            <w:proofErr w:type="spellStart"/>
+            <w:r>
+              <w:t>Ausencia</w:t>
+            </w:r>
+            <w:proofErr w:type="spellEnd"/>
+            <w:r>
+              <w:t xml:space="preserve"> de </w:t>
+            </w:r>
+            <w:proofErr w:type="spellStart"/>
+            <w:r>
+              <w:t>indicadores</w:t>
+            </w:r>
+            <w:proofErr w:type="spellEnd"/>
+          </w:p>
+        </w:tc>
+        <w:tc>
+          <w:tcPr>
+            <w:tcW w:w="4536" w:type="dxa"/>
+            <w:tcBorders>
+              <w:top w:val="single" w:sz="4" w:space="0" w:color="92CDDC" w:themeColor="accent5" w:themeTint="99"/>
+              <w:left w:val="single" w:sz="4" w:space="0" w:color="92CDDC" w:themeColor="accent5" w:themeTint="99"/>
+              <w:bottom w:val="single" w:sz="4" w:space="0" w:color="92CDDC" w:themeColor="accent5" w:themeTint="99"/>
+              <w:right w:val="single" w:sz="4" w:space="0" w:color="92CDDC" w:themeColor="accent5" w:themeTint="99"/>
+            </w:tcBorders>
+            <w:hideMark/>
+          </w:tcPr>
+          <w:p>
+            <w:pPr>
+              <w:cnfStyle w:val="000000100000" w:firstRow="0" w:lastRow="0" w:firstColumn="0" w:lastColumn="0" w:oddVBand="0" w:evenVBand="0" w:oddHBand="1" w:evenHBand="0" w:firstRowFirstColumn="0" w:firstRowLastColumn="0" w:lastRowFirstColumn="0" w:lastRowLastColumn="0"/>
+              <w:rPr>
+                <w:lang w:val="es-US"/>
+              </w:rPr>
+            </w:pPr>
+            <w:r>
+              <w:rPr>
+                <w:lang w:val="es-US"/>
+              </w:rPr>
+              <w:t>Monitoreo (y parcialmente Información y Comunicación)</w:t>
+            </w:r>
+          </w:p>
+        </w:tc>
+      </w:tr>
+      <w:tr>
+        <w:tc>
+          <w:tcPr>
+            <w:cnfStyle w:val="001000000000" w:firstRow="0" w:lastRow="0" w:firstColumn="1" w:lastColumn="0" w:oddVBand="0" w:evenVBand="0" w:oddHBand="0" w:evenHBand="0" w:firstRowFirstColumn="0" w:firstRowLastColumn="0" w:lastRowFirstColumn="0" w:lastRowLastColumn="0"/>
+            <w:tcW w:w="5240" w:type="dxa"/>
+            <w:tcBorders>
+              <w:top w:val="single" w:sz="4" w:space="0" w:color="92CDDC" w:themeColor="accent5" w:themeTint="99"/>
+              <w:left w:val="single" w:sz="4" w:space="0" w:color="92CDDC" w:themeColor="accent5" w:themeTint="99"/>
+              <w:bottom w:val="single" w:sz="4" w:space="0" w:color="92CDDC" w:themeColor="accent5" w:themeTint="99"/>
+              <w:right w:val="single" w:sz="4" w:space="0" w:color="92CDDC" w:themeColor="accent5" w:themeTint="99"/>
+            </w:tcBorders>
+            <w:hideMark/>
+          </w:tcPr>
+          <w:p>
+            <w:proofErr w:type="spellStart"/>
+            <w:r>
+              <w:t>Falta</w:t>
+            </w:r>
+            <w:proofErr w:type="spellEnd"/>
+            <w:r>
+              <w:t xml:space="preserve"> de </w:t>
+            </w:r>
+            <w:proofErr w:type="spellStart"/>
+            <w:r>
+              <w:t>monitoreo</w:t>
+            </w:r>
+            <w:proofErr w:type="spellEnd"/>
+          </w:p>
+        </w:tc>
+        <w:tc>
+          <w:tcPr>
+            <w:tcW w:w="4536" w:type="dxa"/>
+            <w:tcBorders>
+              <w:top w:val="single" w:sz="4" w:space="0" w:color="92CDDC" w:themeColor="accent5" w:themeTint="99"/>
+              <w:left w:val="single" w:sz="4" w:space="0" w:color="92CDDC" w:themeColor="accent5" w:themeTint="99"/>
+              <w:bottom w:val="single" w:sz="4" w:space="0" w:color="92CDDC" w:themeColor="accent5" w:themeTint="99"/>
+              <w:right w:val="single" w:sz="4" w:space="0" w:color="92CDDC" w:themeColor="accent5" w:themeTint="99"/>
+            </w:tcBorders>
+            <w:hideMark/>
+          </w:tcPr>
+          <w:p>
+            <w:pPr>
+              <w:cnfStyle w:val="000000000000" w:firstRow="0" w:lastRow="0" w:firstColumn="0" w:lastColumn="0" w:oddVBand="0" w:evenVBand="0" w:oddHBand="0" w:evenHBand="0" w:firstRowFirstColumn="0" w:firstRowLastColumn="0" w:lastRowFirstColumn="0" w:lastRowLastColumn="0"/>
+            </w:pPr>
+            <w:proofErr w:type="spellStart"/>
+            <w:r>
+              <w:t>Monitoreo</w:t>
+            </w:r>
+            <w:proofErr w:type="spellEnd"/>
+          </w:p>
+        </w:tc>
+      </w:tr>
+      <w:tr>
+        <w:trPr>
+          <w:cnfStyle w:val="000000100000" w:firstRow="0" w:lastRow="0" w:firstColumn="0" w:lastColumn="0" w:oddVBand="0" w:evenVBand="0" w:oddHBand="1" w:evenHBand="0" w:firstRowFirstColumn="0" w:firstRowLastColumn="0" w:lastRowFirstColumn="0" w:lastRowLastColumn="0"/>
+        </w:trPr>
+        <w:tc>
+          <w:tcPr>
+            <w:cnfStyle w:val="001000000000" w:firstRow="0" w:lastRow="0" w:firstColumn="1" w:lastColumn="0" w:oddVBand="0" w:evenVBand="0" w:oddHBand="0" w:evenHBand="0" w:firstRowFirstColumn="0" w:firstRowLastColumn="0" w:lastRowFirstColumn="0" w:lastRowLastColumn="0"/>
+            <w:tcW w:w="5240" w:type="dxa"/>
+            <w:tcBorders>
+              <w:top w:val="single" w:sz="4" w:space="0" w:color="92CDDC" w:themeColor="accent5" w:themeTint="99"/>
+              <w:left w:val="single" w:sz="4" w:space="0" w:color="92CDDC" w:themeColor="accent5" w:themeTint="99"/>
+              <w:bottom w:val="single" w:sz="4" w:space="0" w:color="92CDDC" w:themeColor="accent5" w:themeTint="99"/>
+              <w:right w:val="single" w:sz="4" w:space="0" w:color="92CDDC" w:themeColor="accent5" w:themeTint="99"/>
+            </w:tcBorders>
+            <w:hideMark/>
+          </w:tcPr>
+          <w:p>
+            <w:proofErr w:type="spellStart"/>
+            <w:r>
+              <w:t>Incumplimiento</w:t>
+            </w:r>
+            <w:proofErr w:type="spellEnd"/>
+            <w:r>
+              <w:t xml:space="preserve"> de </w:t>
+            </w:r>
+            <w:proofErr w:type="spellStart"/>
+            <w:r>
+              <w:t>políticas</w:t>
+            </w:r>
+            <w:proofErr w:type="spellEnd"/>
+          </w:p>
+        </w:tc>
+        <w:tc>
+          <w:tcPr>
+            <w:tcW w:w="4536" w:type="dxa"/>
+            <w:tcBorders>
+              <w:top w:val="single" w:sz="4" w:space="0" w:color="92CDDC" w:themeColor="accent5" w:themeTint="99"/>
+              <w:left w:val="single" w:sz="4" w:space="0" w:color="92CDDC" w:themeColor="accent5" w:themeTint="99"/>
+              <w:bottom w:val="single" w:sz="4" w:space="0" w:color="92CDDC" w:themeColor="accent5" w:themeTint="99"/>
+              <w:right w:val="single" w:sz="4" w:space="0" w:color="92CDDC" w:themeColor="accent5" w:themeTint="99"/>
+            </w:tcBorders>
+            <w:hideMark/>
+          </w:tcPr>
+          <w:p>
+            <w:pPr>
+              <w:cnfStyle w:val="000000100000" w:firstRow="0" w:lastRow="0" w:firstColumn="0" w:lastColumn="0" w:oddVBand="0" w:evenVBand="0" w:oddHBand="1" w:evenHBand="0" w:firstRowFirstColumn="0" w:firstRowLastColumn="0" w:lastRowFirstColumn="0" w:lastRowLastColumn="0"/>
+            </w:pPr>
+            <w:proofErr w:type="spellStart"/>
+            <w:r>
+              <w:t>Entorno</w:t>
+            </w:r>
+            <w:proofErr w:type="spellEnd"/>
+            <w:r>
+              <w:t xml:space="preserve"> de Control</w:t>
+            </w:r>
+          </w:p>
+        </w:tc>
+      </w:tr>
+    </w:tbl>
+    <w:p>
+      <w:pPr>
+        <w:spacing w:before="100" w:beforeAutospacing="1" w:after="100" w:afterAutospacing="1" w:line="240" w:lineRule="auto"/>
+        <w:rPr>
+          <w:rFonts w:ascii="Courier New" w:hAnsi="Courier New" w:cs="Courier New"/>
+        </w:rPr>
+      </w:pPr>
+      <w:r>
+        <w:rPr>
+          <w:rFonts w:ascii="Courier New" w:hAnsi="Courier New" w:cs="Courier New"/>
+        </w:rPr>
+        <w:t>Explique cómo cada componente COSO contribuye a fortalecer el sistema de control interno del taller.</w:t>
+      </w:r>
+    </w:p>
+    <w:p>
+      <w:pPr>
+        <w:spacing w:before="100" w:beforeAutospacing="1" w:after="100" w:afterAutospacing="1" w:line="240" w:lineRule="auto"/>
+        <w:rPr>
+          <w:rFonts w:ascii="Courier New" w:hAnsi="Courier New" w:cs="Courier New"/>
+          <w:b/>
+          <w:bCs/>
+        </w:rPr>
+      </w:pPr>
+      <w:r>
+        <w:rPr>
+          <w:rFonts w:ascii="Courier New" w:hAnsi="Courier New" w:cs="Courier New"/>
+          <w:b/>
+          <w:bCs/>
+        </w:rPr>
+        <w:t>Explicación de la contribución de cada componente COSO al fortalecimiento del control interno</w:t>
+      </w:r>
+    </w:p>
+    <w:p>
+      <w:pPr>
+        <w:numPr>
+          <w:ilvl w:val="0"/>
+          <w:numId w:val="28"/>
+        </w:numPr>
+        <w:spacing w:before="100" w:beforeAutospacing="1" w:after="100" w:afterAutospacing="1" w:line="240" w:lineRule="auto"/>
+        <w:rPr>
+          <w:rFonts w:ascii="Courier New" w:hAnsi="Courier New" w:cs="Courier New"/>
+        </w:rPr>
+      </w:pPr>
+      <w:r>
+        <w:rPr>
+          <w:rFonts w:ascii="Courier New" w:hAnsi="Courier New" w:cs="Courier New"/>
+          <w:b/>
+          <w:bCs/>
+        </w:rPr>
+        <w:t>Entorno de Control:</w:t>
+      </w:r>
+      <w:r>
+        <w:rPr>
+          <w:rFonts w:ascii="Courier New" w:hAnsi="Courier New" w:cs="Courier New"/>
+        </w:rPr>
+        <w:br/>
+        <w:t>Es la base de todo el sistema de control interno. Al establecer un ambiente donde la dirección demuestra compromiso con la integridad, los valores éticos y la rendición de cuentas, se eliminan prácticas como compartir contraseñas o ignorar las políticas. Fortalecer este componente en “Técnica Express” significa que la Gerencia debe exigir y modelar el uso de cuentas individuales, formalizar políticas y capacitar al personal, creando una cultura de seguridad y disciplina.</w:t>
+      </w:r>
+    </w:p>
+    <w:p>
+      <w:pPr>
+        <w:numPr>
+          <w:ilvl w:val="0"/>
+          <w:numId w:val="28"/>
+        </w:numPr>
+        <w:spacing w:before="100" w:beforeAutospacing="1" w:after="100" w:afterAutospacing="1" w:line="240" w:lineRule="auto"/>
+        <w:rPr>
+          <w:rFonts w:ascii="Courier New" w:hAnsi="Courier New" w:cs="Courier New"/>
+        </w:rPr>
+      </w:pPr>
+      <w:r>
+        <w:rPr>
+          <w:rFonts w:ascii="Courier New" w:hAnsi="Courier New" w:cs="Courier New"/>
+          <w:b/>
+          <w:bCs/>
+        </w:rPr>
+        <w:t>Evaluación de Riesgos:</w:t>
+      </w:r>
+      <w:r>
+        <w:rPr>
+          <w:rFonts w:ascii="Courier New" w:hAnsi="Courier New" w:cs="Courier New"/>
+        </w:rPr>
+        <w:br/>
+        <w:t>Este componente permite identificar y analizar los riesgos que amenazan el logro de los objetivos. Aunque no aparece directamente en la tabla de hallazgos, su aplicación es transversal: obliga al taller a preguntarse “¿qué puede impedir que el sistema apoye la operación?” (p.ej. pérdida de datos, fraude) y diseñar controles proporcionales. Sin una evaluación de riesgos, decisiones como no programar respaldos se toman por omisión.</w:t>
+      </w:r>
+    </w:p>
+    <w:p>
+      <w:pPr>
+        <w:numPr>
+          <w:ilvl w:val="0"/>
+          <w:numId w:val="28"/>
+        </w:numPr>
+        <w:spacing w:before="100" w:beforeAutospacing="1" w:after="100" w:afterAutospacing="1" w:line="240" w:lineRule="auto"/>
+        <w:rPr>
+          <w:rFonts w:ascii="Courier New" w:hAnsi="Courier New" w:cs="Courier New"/>
+        </w:rPr>
+      </w:pPr>
+      <w:r>
+        <w:rPr>
+          <w:rFonts w:ascii="Courier New" w:hAnsi="Courier New" w:cs="Courier New"/>
+          <w:b/>
+          <w:bCs/>
+        </w:rPr>
+        <w:t>Actividades de Control:</w:t>
+      </w:r>
+      <w:r>
+        <w:rPr>
+          <w:rFonts w:ascii="Courier New" w:hAnsi="Courier New" w:cs="Courier New"/>
+        </w:rPr>
+        <w:br/>
+        <w:t xml:space="preserve">Son las políticas, procedimientos y mecanismos que garantizan que las instrucciones de la dirección se cumplan. Incluyen controles preventivos y </w:t>
+      </w:r>
+      <w:proofErr w:type="spellStart"/>
+      <w:r>
+        <w:rPr>
+          <w:rFonts w:ascii="Courier New" w:hAnsi="Courier New" w:cs="Courier New"/>
+        </w:rPr>
+        <w:t>detectivos</w:t>
+      </w:r>
+      <w:proofErr w:type="spellEnd"/>
+      <w:r>
+        <w:rPr>
+          <w:rFonts w:ascii="Courier New" w:hAnsi="Courier New" w:cs="Courier New"/>
+        </w:rPr>
+        <w:t xml:space="preserve"> como copias de seguridad automáticas, segregación de funciones mediante perfiles de usuario, validaciones en el sistema y conciliaciones de inventario. Aplicadas en el taller, aseguran que la información esté protegida, sea íntegra y esté disponible.</w:t>
+      </w:r>
+    </w:p>
+    <w:p>
+      <w:pPr>
+        <w:numPr>
+          <w:ilvl w:val="0"/>
+          <w:numId w:val="28"/>
+        </w:numPr>
+        <w:spacing w:before="100" w:beforeAutospacing="1" w:after="100" w:afterAutospacing="1" w:line="240" w:lineRule="auto"/>
+        <w:rPr>
+          <w:rFonts w:ascii="Courier New" w:hAnsi="Courier New" w:cs="Courier New"/>
+        </w:rPr>
+      </w:pPr>
+      <w:r>
+        <w:rPr>
+          <w:rFonts w:ascii="Courier New" w:hAnsi="Courier New" w:cs="Courier New"/>
+          <w:b/>
+          <w:bCs/>
+        </w:rPr>
+        <w:t>Información y Comunicación:</w:t>
+      </w:r>
+      <w:r>
+        <w:rPr>
+          <w:rFonts w:ascii="Courier New" w:hAnsi="Courier New" w:cs="Courier New"/>
+        </w:rPr>
+        <w:br/>
+        <w:t xml:space="preserve">Provee a todos los niveles de la organización la información relevante y de calidad para tomar decisiones y cumplir responsabilidades. En “Técnica Express”, los reportes gerenciales </w:t>
+      </w:r>
+      <w:r>
+        <w:rPr>
+          <w:rFonts w:ascii="Courier New" w:hAnsi="Courier New" w:cs="Courier New"/>
+        </w:rPr>
+        <w:lastRenderedPageBreak/>
+        <w:t>y los indicadores (</w:t>
+      </w:r>
+      <w:proofErr w:type="spellStart"/>
+      <w:r>
+        <w:rPr>
+          <w:rFonts w:ascii="Courier New" w:hAnsi="Courier New" w:cs="Courier New"/>
+        </w:rPr>
+        <w:t>KPIs</w:t>
+      </w:r>
+      <w:proofErr w:type="spellEnd"/>
+      <w:r>
+        <w:rPr>
+          <w:rFonts w:ascii="Courier New" w:hAnsi="Courier New" w:cs="Courier New"/>
+        </w:rPr>
+        <w:t>) generados por el sistema son justamente eso. Una comunicación eficaz implica que los empleados conozcan sus roles de control y reporten anomalías; la falta de indicadores visibles y de divulgación de políticas rompe este flujo.</w:t>
+      </w:r>
+    </w:p>
+    <w:p>
+      <w:pPr>
+        <w:numPr>
+          <w:ilvl w:val="0"/>
+          <w:numId w:val="28"/>
+        </w:numPr>
+        <w:spacing w:before="100" w:beforeAutospacing="1" w:after="100" w:afterAutospacing="1" w:line="240" w:lineRule="auto"/>
+        <w:rPr>
+          <w:rFonts w:ascii="Courier New" w:hAnsi="Courier New" w:cs="Courier New"/>
+        </w:rPr>
+      </w:pPr>
+      <w:r>
+        <w:rPr>
+          <w:rFonts w:ascii="Courier New" w:hAnsi="Courier New" w:cs="Courier New"/>
+          <w:b/>
+          <w:bCs/>
+        </w:rPr>
+        <w:t>Monitoreo:</w:t>
+      </w:r>
+      <w:r>
+        <w:rPr>
+          <w:rFonts w:ascii="Courier New" w:hAnsi="Courier New" w:cs="Courier New"/>
+        </w:rPr>
+        <w:br/>
+        <w:t xml:space="preserve">Evalúa si los controles están presentes y funcionan a lo largo del tiempo. Incluye supervisiones continuas y evaluaciones periódicas. La ausencia de revisión de accesos, la falta de indicadores de desempeño monitoreados y la inexistencia de bitácoras indican un déficit total de este componente. Fortalecerlo implica instaurar revisiones trimestrales de </w:t>
+      </w:r>
+      <w:proofErr w:type="spellStart"/>
+      <w:r>
+        <w:rPr>
+          <w:rFonts w:ascii="Courier New" w:hAnsi="Courier New" w:cs="Courier New"/>
+        </w:rPr>
+        <w:t>logs</w:t>
+      </w:r>
+      <w:proofErr w:type="spellEnd"/>
+      <w:r>
+        <w:rPr>
+          <w:rFonts w:ascii="Courier New" w:hAnsi="Courier New" w:cs="Courier New"/>
+        </w:rPr>
+        <w:t xml:space="preserve">, analizar mensualmente los </w:t>
+      </w:r>
+      <w:proofErr w:type="spellStart"/>
+      <w:r>
+        <w:rPr>
+          <w:rFonts w:ascii="Courier New" w:hAnsi="Courier New" w:cs="Courier New"/>
+        </w:rPr>
+        <w:t>KPIs</w:t>
+      </w:r>
+      <w:proofErr w:type="spellEnd"/>
+      <w:r>
+        <w:rPr>
+          <w:rFonts w:ascii="Courier New" w:hAnsi="Courier New" w:cs="Courier New"/>
+        </w:rPr>
+        <w:t xml:space="preserve"> y verificar que los respaldos se ejecuten correctamente, cerrando así el ciclo de mejora </w:t>
+      </w:r>
+      <w:proofErr w:type="gramStart"/>
+      <w:r>
+        <w:rPr>
+          <w:rFonts w:ascii="Courier New" w:hAnsi="Courier New" w:cs="Courier New"/>
+        </w:rPr>
+        <w:t>continua</w:t>
+      </w:r>
+      <w:proofErr w:type="gramEnd"/>
+      <w:r>
+        <w:rPr>
+          <w:rFonts w:ascii="Courier New" w:hAnsi="Courier New" w:cs="Courier New"/>
+        </w:rPr>
+        <w:t>.</w:t>
+      </w:r>
+    </w:p>
+    <w:p>
+      <w:pPr>
+        <w:spacing w:before="100" w:beforeAutospacing="1" w:after="100" w:afterAutospacing="1" w:line="240" w:lineRule="auto"/>
+        <w:rPr>
+          <w:rFonts w:ascii="Courier New" w:hAnsi="Courier New" w:cs="Courier New"/>
+          <w:lang w:val="es-ES"/>
+        </w:rPr>
+      </w:pPr>
+    </w:p>
+    <w:p>
+      <w:pPr>
+        <w:pStyle w:val="Ttulo1"/>
+        <w:rPr>
+          <w:rFonts w:ascii="Courier New" w:hAnsi="Courier New" w:cs="Courier New"/>
+          <w:color w:val="0070C0"/>
+          <w:sz w:val="36"/>
+          <w:szCs w:val="36"/>
+          <w:lang w:val="es-ES"/>
+        </w:rPr>
+      </w:pPr>
+      <w:r>
+        <w:rPr>
+          <w:rFonts w:ascii="Courier New" w:hAnsi="Courier New" w:cs="Courier New"/>
+          <w:color w:val="0070C0"/>
+          <w:sz w:val="36"/>
+          <w:szCs w:val="36"/>
+          <w:lang w:val="es-ES"/>
+        </w:rPr>
+        <w:t>IX. ACTIVIDAD DE ANÁLISIS CRÍTICO</w:t>
+      </w:r>
+    </w:p>
+    <w:p>
+      <w:pPr>
+        <w:spacing w:before="100" w:beforeAutospacing="1" w:after="100" w:afterAutospacing="1" w:line="240" w:lineRule="auto"/>
+        <w:rPr>
+          <w:rFonts w:ascii="Courier New" w:eastAsia="Times New Roman" w:hAnsi="Courier New" w:cs="Courier New"/>
+          <w:sz w:val="24"/>
+          <w:szCs w:val="24"/>
+          <w:lang w:val="es-ES"/>
+        </w:rPr>
+      </w:pPr>
+      <w:r>
+        <w:rPr>
+          <w:rFonts w:ascii="Courier New" w:eastAsia="Times New Roman" w:hAnsi="Courier New" w:cs="Courier New"/>
+          <w:sz w:val="24"/>
+          <w:szCs w:val="24"/>
+        </w:rPr>
+        <w:t>Responda de manera argumentada:</w:t>
+      </w:r>
+    </w:p>
+    <w:p>
+      <w:pPr>
+        <w:spacing w:before="100" w:beforeAutospacing="1" w:after="100" w:afterAutospacing="1" w:line="240" w:lineRule="auto"/>
+        <w:outlineLvl w:val="2"/>
+        <w:rPr>
+          <w:rFonts w:ascii="Courier New" w:eastAsia="Times New Roman" w:hAnsi="Courier New" w:cs="Courier New"/>
+          <w:sz w:val="24"/>
+          <w:szCs w:val="24"/>
+        </w:rPr>
+      </w:pPr>
+      <w:r>
+        <w:rPr>
+          <w:rFonts w:ascii="Courier New" w:eastAsia="Times New Roman" w:hAnsi="Courier New" w:cs="Courier New"/>
+          <w:b/>
+          <w:bCs/>
+          <w:sz w:val="24"/>
+          <w:szCs w:val="24"/>
+        </w:rPr>
+        <w:t>1. ¿Cómo contribuye el sistema de información al crecimiento de Técnica Express?</w:t>
+      </w:r>
+      <w:r>
+        <w:rPr>
+          <w:rFonts w:ascii="Courier New" w:eastAsia="Times New Roman" w:hAnsi="Courier New" w:cs="Courier New"/>
+          <w:sz w:val="24"/>
+          <w:szCs w:val="24"/>
+        </w:rPr>
+        <w:br/>
+        <w:t xml:space="preserve">El sistema contribuye de forma directa al crecimiento sostenible del taller al profesionalizar la gestión. Automatiza procesos que antes demandaban horas de trabajo manual, reduciendo tiempos muertos y errores. La disponibilidad de datos confiables permite a la Gerencia identificar los servicios más rentables, anticipar picos de demanda y fidelizar clientes con historiales completos y atención más ágil. Al mejorar el control de inventario, se evitan </w:t>
+      </w:r>
+      <w:proofErr w:type="gramStart"/>
+      <w:r>
+        <w:rPr>
+          <w:rFonts w:ascii="Courier New" w:eastAsia="Times New Roman" w:hAnsi="Courier New" w:cs="Courier New"/>
+          <w:sz w:val="24"/>
+          <w:szCs w:val="24"/>
+        </w:rPr>
+        <w:t>tanto paros</w:t>
+      </w:r>
+      <w:proofErr w:type="gramEnd"/>
+      <w:r>
+        <w:rPr>
+          <w:rFonts w:ascii="Courier New" w:eastAsia="Times New Roman" w:hAnsi="Courier New" w:cs="Courier New"/>
+          <w:sz w:val="24"/>
+          <w:szCs w:val="24"/>
+        </w:rPr>
+        <w:t xml:space="preserve"> por falta de repuestos como inversiones ociosas. En definitiva, el sistema construye la base de información necesaria para que el taller deje de administrarse “por intuición” y escale su operación sin caer en el caos que acompañó su crecimiento inicial.</w:t>
+      </w:r>
+    </w:p>
+    <w:p>
+      <w:pPr>
+        <w:spacing w:before="100" w:beforeAutospacing="1" w:after="100" w:afterAutospacing="1" w:line="240" w:lineRule="auto"/>
+        <w:outlineLvl w:val="2"/>
+        <w:rPr>
+          <w:rFonts w:ascii="Courier New" w:eastAsia="Times New Roman" w:hAnsi="Courier New" w:cs="Courier New"/>
+          <w:sz w:val="24"/>
+          <w:szCs w:val="24"/>
+        </w:rPr>
+      </w:pPr>
+      <w:r>
+        <w:rPr>
+          <w:rFonts w:ascii="Courier New" w:eastAsia="Times New Roman" w:hAnsi="Courier New" w:cs="Courier New"/>
+          <w:b/>
+          <w:bCs/>
+          <w:sz w:val="24"/>
+          <w:szCs w:val="24"/>
+        </w:rPr>
+        <w:t>2. ¿Qué ocurriría si la empresa continúa operando sin controles adecuados?</w:t>
+      </w:r>
+      <w:r>
+        <w:rPr>
+          <w:rFonts w:ascii="Courier New" w:eastAsia="Times New Roman" w:hAnsi="Courier New" w:cs="Courier New"/>
+          <w:sz w:val="24"/>
+          <w:szCs w:val="24"/>
+        </w:rPr>
+        <w:br/>
+        <w:t xml:space="preserve">Operar sin los controles identificados (accesos compartidos, falta de respaldo, ausencia de monitoreo) es un riesgo existencial. A corto plazo, cualquier fallo de hardware, error humano o empleado malintencionado podría eliminar información irrecuperablemente, deteniendo toda la facturación y el servicio. La empresa quedaría expuesta a fraudes, a sanciones por incumplimiento de protección de datos y a demandas de clientes. En el mediano plazo, la desconfianza de los clientes y la imposibilidad de mantener la continuidad del negocio dañarían la reputación, revirtiendo el crecimiento logrado. La falta de </w:t>
+      </w:r>
+      <w:r>
+        <w:rPr>
+          <w:rFonts w:ascii="Courier New" w:eastAsia="Times New Roman" w:hAnsi="Courier New" w:cs="Courier New"/>
+          <w:sz w:val="24"/>
+          <w:szCs w:val="24"/>
+        </w:rPr>
+        <w:lastRenderedPageBreak/>
+        <w:t>monitoreo perpetuaría estas debilidades, impidiendo la mejora y generando una falsa sensación de seguridad.</w:t>
+      </w:r>
+    </w:p>
+    <w:p>
+      <w:pPr>
+        <w:spacing w:before="100" w:beforeAutospacing="1" w:after="100" w:afterAutospacing="1" w:line="240" w:lineRule="auto"/>
+        <w:outlineLvl w:val="2"/>
+        <w:rPr>
+          <w:rFonts w:ascii="Courier New" w:eastAsia="Times New Roman" w:hAnsi="Courier New" w:cs="Courier New"/>
+          <w:sz w:val="24"/>
+          <w:szCs w:val="24"/>
+        </w:rPr>
+      </w:pPr>
+      <w:r>
+        <w:rPr>
+          <w:rFonts w:ascii="Courier New" w:eastAsia="Times New Roman" w:hAnsi="Courier New" w:cs="Courier New"/>
+          <w:b/>
+          <w:bCs/>
+          <w:sz w:val="24"/>
+          <w:szCs w:val="24"/>
+        </w:rPr>
+        <w:t>3. ¿Qué beneficios aporta COBIT 2019 al gobierno de TI?</w:t>
+      </w:r>
+      <w:r>
+        <w:rPr>
+          <w:rFonts w:ascii="Courier New" w:eastAsia="Times New Roman" w:hAnsi="Courier New" w:cs="Courier New"/>
+          <w:sz w:val="24"/>
+          <w:szCs w:val="24"/>
+        </w:rPr>
+        <w:br/>
+        <w:t>COBIT 2019 proporciona un marco integral para alinear la tecnología con los objetivos estratégicos del negocio. En el caso de “Técnica Express”, permite a la Gerencia entender que el sistema no es solo una herramienta operativa, sino un activo que debe gobernarse. El dominio MEA en particular ayuda a establecer indicadores (MEA01), evaluar el sistema de control interno (MEA02) y verificar el cumplimiento de requisitos externos (MEA03). COBIT fomenta la cultura de “valor de TI”, asegurando que cada inversión tecnológica esté justificada por beneficios medibles, optimice riesgos y se gestione con responsabilidad.</w:t>
+      </w:r>
+    </w:p>
+    <w:p>
+      <w:pPr>
+        <w:spacing w:before="100" w:beforeAutospacing="1" w:after="100" w:afterAutospacing="1" w:line="240" w:lineRule="auto"/>
+        <w:outlineLvl w:val="2"/>
+        <w:rPr>
+          <w:rFonts w:ascii="Courier New" w:eastAsia="Times New Roman" w:hAnsi="Courier New" w:cs="Courier New"/>
+          <w:sz w:val="24"/>
+          <w:szCs w:val="24"/>
+        </w:rPr>
+      </w:pPr>
+      <w:r>
+        <w:rPr>
+          <w:rFonts w:ascii="Courier New" w:eastAsia="Times New Roman" w:hAnsi="Courier New" w:cs="Courier New"/>
+          <w:b/>
+          <w:bCs/>
+          <w:sz w:val="24"/>
+          <w:szCs w:val="24"/>
+        </w:rPr>
+        <w:t>4. ¿Cómo complementa COSO el trabajo realizado con COBIT?</w:t>
+      </w:r>
+      <w:r>
+        <w:rPr>
+          <w:rFonts w:ascii="Courier New" w:eastAsia="Times New Roman" w:hAnsi="Courier New" w:cs="Courier New"/>
+          <w:sz w:val="24"/>
+          <w:szCs w:val="24"/>
+        </w:rPr>
+        <w:br/>
+        <w:t>Mientras COBIT se enfoca en el gobierno y la gestión de la TI de manera específica, COSO proporciona el modelo de control interno empresarial ampliamente aceptado. Al aplicar COSO, los hallazgos técnicos de la auditoría (accesos compartidos, falta de bitácoras) se traducen a debilidades en componentes como “Actividades de Control” o “Monitoreo”, que son comprensibles para toda la administración. COSO complementa a COBIT al ofrecer una estructura para que la Gerencia evalúe el ambiente de control global del taller, no solo la tecnología. Juntos, aseguran que los controles de TI no estén aislados, sino integrados en la gestión de riesgos corporativos.</w:t>
+      </w:r>
+    </w:p>
+    <w:p>
+      <w:pPr>
+        <w:spacing w:before="100" w:beforeAutospacing="1" w:after="100" w:afterAutospacing="1" w:line="240" w:lineRule="auto"/>
+        <w:outlineLvl w:val="2"/>
+        <w:rPr>
+          <w:rFonts w:ascii="Courier New" w:eastAsia="Times New Roman" w:hAnsi="Courier New" w:cs="Courier New"/>
+          <w:sz w:val="24"/>
+          <w:szCs w:val="24"/>
+        </w:rPr>
+      </w:pPr>
+      <w:r>
+        <w:rPr>
+          <w:rFonts w:ascii="Courier New" w:eastAsia="Times New Roman" w:hAnsi="Courier New" w:cs="Courier New"/>
+          <w:b/>
+          <w:bCs/>
+          <w:sz w:val="24"/>
+          <w:szCs w:val="24"/>
+        </w:rPr>
+        <w:t>5. ¿Qué decisiones estratégicas podrían tomarse utilizando la información generada por el sistema?</w:t>
+      </w:r>
+      <w:r>
+        <w:rPr>
+          <w:rFonts w:ascii="Courier New" w:eastAsia="Times New Roman" w:hAnsi="Courier New" w:cs="Courier New"/>
+          <w:sz w:val="24"/>
+          <w:szCs w:val="24"/>
+        </w:rPr>
+        <w:br/>
+        <w:t>Con los reportes de productividad por técnico, la Gerencia podría rediseñar los incentivos salariales o identificar necesidades de capacitación específicas. Analizando la frecuencia de servicios y el inventario consumido, se podría negociar mejores precios con proveedores o ampliar los servicios de mayor demanda (por ejemplo, diagnóstico computarizado). Los indicadores de satisfacción y reclamos permitirían implementar un programa de fidelización o garantizar un estándar mínimo de calidad. Además, el histórico de órdenes de trabajo, ahora confiable, permite proyectar flujos de caja, justificar la apertura de una segunda sucursal o decidir la compra de equipamiento especializado con datos concretos de retorno de inversión.</w:t>
+      </w:r>
+    </w:p>
+    <w:p>
+      <w:pPr>
+        <w:spacing w:before="100" w:beforeAutospacing="1" w:after="100" w:afterAutospacing="1" w:line="240" w:lineRule="auto"/>
+        <w:outlineLvl w:val="2"/>
+        <w:rPr>
+          <w:rFonts w:ascii="Courier New" w:eastAsia="Times New Roman" w:hAnsi="Courier New" w:cs="Courier New"/>
+          <w:sz w:val="24"/>
+          <w:szCs w:val="24"/>
+        </w:rPr>
+      </w:pPr>
+    </w:p>
+    <w:p>
+      <w:pPr>
+        <w:spacing w:before="100" w:beforeAutospacing="1" w:after="100" w:afterAutospacing="1" w:line="240" w:lineRule="auto"/>
+        <w:outlineLvl w:val="2"/>
+        <w:rPr>
+          <w:rFonts w:ascii="Courier New" w:eastAsia="Times New Roman" w:hAnsi="Courier New" w:cs="Courier New"/>
+          <w:sz w:val="24"/>
+          <w:szCs w:val="24"/>
+        </w:rPr>
+      </w:pPr>
+    </w:p>
+    <w:p>
+      <w:pPr>
+        <w:spacing w:before="100" w:beforeAutospacing="1" w:after="100" w:afterAutospacing="1" w:line="240" w:lineRule="auto"/>
+        <w:outlineLvl w:val="2"/>
+        <w:rPr>
+          <w:rFonts w:ascii="Courier New" w:eastAsia="Times New Roman" w:hAnsi="Courier New" w:cs="Courier New"/>
+          <w:b/>
+          <w:bCs/>
+          <w:sz w:val="27"/>
+          <w:szCs w:val="27"/>
+        </w:rPr>
+      </w:pPr>
+      <w:r>
+        <w:rPr>
+          <w:rFonts w:ascii="Courier New" w:eastAsia="Times New Roman" w:hAnsi="Courier New" w:cs="Courier New"/>
+          <w:b/>
+          <w:bCs/>
+          <w:sz w:val="27"/>
+          <w:szCs w:val="27"/>
+        </w:rPr>
+        <w:lastRenderedPageBreak/>
+        <w:t>ACTIVIDAD 8. ELABORACIÓN DE HALLAZGOS DE AUDITORÍA</w:t>
+      </w:r>
+    </w:p>
+    <w:p>
+      <w:pPr>
+        <w:spacing w:before="100" w:beforeAutospacing="1" w:after="100" w:afterAutospacing="1" w:line="240" w:lineRule="auto"/>
+        <w:outlineLvl w:val="2"/>
+        <w:rPr>
+          <w:rFonts w:ascii="Courier New" w:eastAsia="Times New Roman" w:hAnsi="Courier New" w:cs="Courier New"/>
+          <w:sz w:val="24"/>
+          <w:szCs w:val="24"/>
+        </w:rPr>
+      </w:pPr>
+      <w:r>
+        <w:rPr>
+          <w:rFonts w:ascii="Courier New" w:eastAsia="Times New Roman" w:hAnsi="Courier New" w:cs="Courier New"/>
+          <w:sz w:val="24"/>
+          <w:szCs w:val="24"/>
+        </w:rPr>
+        <w:t>Aplicando la metodología Condición – Criterio – Causa – Efecto – Recomendación, se formulan tres hallazgos representativos de la situación encontrada.</w:t>
+      </w:r>
+    </w:p>
+    <w:p>
+      <w:pPr>
+        <w:spacing w:before="100" w:beforeAutospacing="1" w:after="100" w:afterAutospacing="1" w:line="240" w:lineRule="auto"/>
+        <w:outlineLvl w:val="2"/>
+        <w:rPr>
+          <w:rFonts w:ascii="Courier New" w:eastAsia="Times New Roman" w:hAnsi="Courier New" w:cs="Courier New"/>
+          <w:b/>
+          <w:bCs/>
+          <w:sz w:val="24"/>
+          <w:szCs w:val="24"/>
+        </w:rPr>
+      </w:pPr>
+      <w:r>
+        <w:rPr>
+          <w:rFonts w:ascii="Courier New" w:eastAsia="Times New Roman" w:hAnsi="Courier New" w:cs="Courier New"/>
+          <w:b/>
+          <w:bCs/>
+          <w:sz w:val="24"/>
+          <w:szCs w:val="24"/>
+        </w:rPr>
+        <w:t>Hallazgo No. 1: Uso generalizado de credenciales compartidas</w:t>
+      </w:r>
+    </w:p>
+    <w:p>
+      <w:pPr>
+        <w:spacing w:before="100" w:beforeAutospacing="1" w:after="100" w:afterAutospacing="1" w:line="240" w:lineRule="auto"/>
+        <w:outlineLvl w:val="2"/>
+        <w:rPr>
+          <w:rFonts w:ascii="Courier New" w:eastAsia="Times New Roman" w:hAnsi="Courier New" w:cs="Courier New"/>
+          <w:sz w:val="24"/>
+          <w:szCs w:val="24"/>
+        </w:rPr>
+      </w:pPr>
+      <w:r>
+        <w:rPr>
+          <w:rFonts w:ascii="Courier New" w:eastAsia="Times New Roman" w:hAnsi="Courier New" w:cs="Courier New"/>
+          <w:b/>
+          <w:bCs/>
+          <w:sz w:val="24"/>
+          <w:szCs w:val="24"/>
+        </w:rPr>
+        <w:t>Condición:</w:t>
+      </w:r>
+      <w:r>
+        <w:rPr>
+          <w:rFonts w:ascii="Courier New" w:eastAsia="Times New Roman" w:hAnsi="Courier New" w:cs="Courier New"/>
+          <w:sz w:val="24"/>
+          <w:szCs w:val="24"/>
+        </w:rPr>
+        <w:br/>
+        <w:t>Durante la inspección se verificó que todos los empleados del taller acceden al sistema con una misma contraseña genérica, a pesar de que la plataforma cuenta con un módulo de gestión de usuarios y perfiles.</w:t>
+      </w:r>
+    </w:p>
+    <w:p>
+      <w:pPr>
+        <w:spacing w:before="100" w:beforeAutospacing="1" w:after="100" w:afterAutospacing="1" w:line="240" w:lineRule="auto"/>
+        <w:outlineLvl w:val="2"/>
+        <w:rPr>
+          <w:rFonts w:ascii="Courier New" w:eastAsia="Times New Roman" w:hAnsi="Courier New" w:cs="Courier New"/>
+          <w:sz w:val="24"/>
+          <w:szCs w:val="24"/>
+        </w:rPr>
+      </w:pPr>
+      <w:r>
+        <w:rPr>
+          <w:rFonts w:ascii="Courier New" w:eastAsia="Times New Roman" w:hAnsi="Courier New" w:cs="Courier New"/>
+          <w:b/>
+          <w:bCs/>
+          <w:sz w:val="24"/>
+          <w:szCs w:val="24"/>
+        </w:rPr>
+        <w:t>Criterio:</w:t>
+      </w:r>
+      <w:r>
+        <w:rPr>
+          <w:rFonts w:ascii="Courier New" w:eastAsia="Times New Roman" w:hAnsi="Courier New" w:cs="Courier New"/>
+          <w:sz w:val="24"/>
+          <w:szCs w:val="24"/>
+        </w:rPr>
+        <w:br/>
+        <w:t>El marco COBIT 2019, a través del objetivo de gestión DSS05 (Servicios de seguridad gestionados), y las buenas prácticas de control interno de COSO (Actividades de Control) establecen que cada usuario debe contar con una identificación única y autenticación personal para garantizar la segregación de funciones, la responsabilidad sobre las acciones y la protección contra accesos no autorizados.</w:t>
+      </w:r>
+    </w:p>
+    <w:p>
+      <w:pPr>
+        <w:spacing w:before="100" w:beforeAutospacing="1" w:after="100" w:afterAutospacing="1" w:line="240" w:lineRule="auto"/>
+        <w:outlineLvl w:val="2"/>
+        <w:rPr>
+          <w:rFonts w:ascii="Courier New" w:eastAsia="Times New Roman" w:hAnsi="Courier New" w:cs="Courier New"/>
+          <w:sz w:val="24"/>
+          <w:szCs w:val="24"/>
+        </w:rPr>
+      </w:pPr>
+      <w:r>
+        <w:rPr>
+          <w:rFonts w:ascii="Courier New" w:eastAsia="Times New Roman" w:hAnsi="Courier New" w:cs="Courier New"/>
+          <w:b/>
+          <w:bCs/>
+          <w:sz w:val="24"/>
+          <w:szCs w:val="24"/>
+        </w:rPr>
+        <w:t>Causa:</w:t>
+      </w:r>
+      <w:r>
+        <w:rPr>
+          <w:rFonts w:ascii="Courier New" w:eastAsia="Times New Roman" w:hAnsi="Courier New" w:cs="Courier New"/>
+          <w:sz w:val="24"/>
+          <w:szCs w:val="24"/>
+        </w:rPr>
+        <w:br/>
+        <w:t>Falta de configuración inicial por parte del equipo de desarrollo y ausencia de un responsable de TI que definiera los perfiles y forzara el cambio de contraseña en el primer ingreso. La Gerencia priorizó la rapidez operativa sobre la seguridad.</w:t>
+      </w:r>
+    </w:p>
+    <w:p>
+      <w:pPr>
+        <w:spacing w:before="100" w:beforeAutospacing="1" w:after="100" w:afterAutospacing="1" w:line="240" w:lineRule="auto"/>
+        <w:outlineLvl w:val="2"/>
+        <w:rPr>
+          <w:rFonts w:ascii="Courier New" w:eastAsia="Times New Roman" w:hAnsi="Courier New" w:cs="Courier New"/>
+          <w:sz w:val="24"/>
+          <w:szCs w:val="24"/>
+        </w:rPr>
+      </w:pPr>
+      <w:r>
+        <w:rPr>
+          <w:rFonts w:ascii="Courier New" w:eastAsia="Times New Roman" w:hAnsi="Courier New" w:cs="Courier New"/>
+          <w:b/>
+          <w:bCs/>
+          <w:sz w:val="24"/>
+          <w:szCs w:val="24"/>
+        </w:rPr>
+        <w:t>Efecto:</w:t>
+      </w:r>
+      <w:r>
+        <w:rPr>
+          <w:rFonts w:ascii="Courier New" w:eastAsia="Times New Roman" w:hAnsi="Courier New" w:cs="Courier New"/>
+          <w:sz w:val="24"/>
+          <w:szCs w:val="24"/>
+        </w:rPr>
+        <w:br/>
+        <w:t>Riesgo elevado de acceso no autorizado, modificación o borrado indebido de órdenes de trabajo e información financiera. Es imposible rastrear quién realizó una transacción, anulando la rendición de cuentas y facilitando posibles fraudes o errores no detectados.</w:t>
+      </w:r>
+    </w:p>
+    <w:p>
+      <w:pPr>
+        <w:spacing w:before="100" w:beforeAutospacing="1" w:after="100" w:afterAutospacing="1" w:line="240" w:lineRule="auto"/>
+        <w:outlineLvl w:val="2"/>
+        <w:rPr>
+          <w:rFonts w:ascii="Courier New" w:eastAsia="Times New Roman" w:hAnsi="Courier New" w:cs="Courier New"/>
+          <w:sz w:val="24"/>
+          <w:szCs w:val="24"/>
+        </w:rPr>
+      </w:pPr>
+      <w:r>
+        <w:rPr>
+          <w:rFonts w:ascii="Courier New" w:eastAsia="Times New Roman" w:hAnsi="Courier New" w:cs="Courier New"/>
+          <w:b/>
+          <w:bCs/>
+          <w:sz w:val="24"/>
+          <w:szCs w:val="24"/>
+        </w:rPr>
+        <w:t>Recomendación:</w:t>
+      </w:r>
+      <w:r>
+        <w:rPr>
+          <w:rFonts w:ascii="Courier New" w:eastAsia="Times New Roman" w:hAnsi="Courier New" w:cs="Courier New"/>
+          <w:sz w:val="24"/>
+          <w:szCs w:val="24"/>
+        </w:rPr>
+        <w:br/>
+        <w:t>Configurar cuentas individuales nominativas con roles predefinidos (recepción, mecánico, administrador). Establecer una política de contraseñas robustas (longitud, caducidad) y realizar una revisión semestral de los permisos asignados, desactivando las cuentas obsoletas.</w:t>
+      </w:r>
+    </w:p>
+    <w:p>
+      <w:pPr>
+        <w:spacing w:before="100" w:beforeAutospacing="1" w:after="100" w:afterAutospacing="1" w:line="240" w:lineRule="auto"/>
+        <w:outlineLvl w:val="2"/>
+        <w:rPr>
+          <w:rFonts w:ascii="Courier New" w:eastAsia="Times New Roman" w:hAnsi="Courier New" w:cs="Courier New"/>
+          <w:sz w:val="24"/>
+          <w:szCs w:val="24"/>
+        </w:rPr>
+      </w:pPr>
+    </w:p>
+    <w:p>
+      <w:pPr>
+        <w:spacing w:before="100" w:beforeAutospacing="1" w:after="100" w:afterAutospacing="1" w:line="240" w:lineRule="auto"/>
+        <w:outlineLvl w:val="2"/>
+        <w:rPr>
+          <w:rFonts w:ascii="Courier New" w:eastAsia="Times New Roman" w:hAnsi="Courier New" w:cs="Courier New"/>
+          <w:sz w:val="24"/>
+          <w:szCs w:val="24"/>
+        </w:rPr>
+      </w:pPr>
+    </w:p>
+    <w:p>
+      <w:pPr>
+        <w:spacing w:before="100" w:beforeAutospacing="1" w:after="100" w:afterAutospacing="1" w:line="240" w:lineRule="auto"/>
+        <w:outlineLvl w:val="2"/>
+        <w:rPr>
+          <w:rFonts w:ascii="Courier New" w:eastAsia="Times New Roman" w:hAnsi="Courier New" w:cs="Courier New"/>
+          <w:b/>
+          <w:bCs/>
+          <w:sz w:val="24"/>
+          <w:szCs w:val="24"/>
+        </w:rPr>
+      </w:pPr>
+      <w:r>
+        <w:rPr>
+          <w:rFonts w:ascii="Courier New" w:eastAsia="Times New Roman" w:hAnsi="Courier New" w:cs="Courier New"/>
+          <w:b/>
+          <w:bCs/>
+          <w:sz w:val="24"/>
+          <w:szCs w:val="24"/>
+        </w:rPr>
+        <w:lastRenderedPageBreak/>
+        <w:t>Hallazgo No. 2: Inexistencia de copias de seguridad y plan de recuperación</w:t>
+      </w:r>
+    </w:p>
+    <w:p>
+      <w:pPr>
+        <w:spacing w:before="100" w:beforeAutospacing="1" w:after="100" w:afterAutospacing="1" w:line="240" w:lineRule="auto"/>
+        <w:outlineLvl w:val="2"/>
+        <w:rPr>
+          <w:rFonts w:ascii="Courier New" w:eastAsia="Times New Roman" w:hAnsi="Courier New" w:cs="Courier New"/>
+          <w:sz w:val="24"/>
+          <w:szCs w:val="24"/>
+        </w:rPr>
+      </w:pPr>
+      <w:r>
+        <w:rPr>
+          <w:rFonts w:ascii="Courier New" w:eastAsia="Times New Roman" w:hAnsi="Courier New" w:cs="Courier New"/>
+          <w:b/>
+          <w:bCs/>
+          <w:sz w:val="24"/>
+          <w:szCs w:val="24"/>
+        </w:rPr>
+        <w:t>Condición:</w:t>
+      </w:r>
+      <w:r>
+        <w:rPr>
+          <w:rFonts w:ascii="Courier New" w:eastAsia="Times New Roman" w:hAnsi="Courier New" w:cs="Courier New"/>
+          <w:sz w:val="24"/>
+          <w:szCs w:val="24"/>
+        </w:rPr>
+        <w:br/>
+        <w:t>No se ejecutan respaldos programados de la base de datos del sistema ni existe un procedimiento documentado de recuperación ante desastres. La información opera sin respaldo externo o en nube.</w:t>
+      </w:r>
+    </w:p>
+    <w:p>
+      <w:pPr>
+        <w:spacing w:before="100" w:beforeAutospacing="1" w:after="100" w:afterAutospacing="1" w:line="240" w:lineRule="auto"/>
+        <w:outlineLvl w:val="2"/>
+        <w:rPr>
+          <w:rFonts w:ascii="Courier New" w:eastAsia="Times New Roman" w:hAnsi="Courier New" w:cs="Courier New"/>
+          <w:sz w:val="24"/>
+          <w:szCs w:val="24"/>
+        </w:rPr>
+      </w:pPr>
+      <w:r>
+        <w:rPr>
+          <w:rFonts w:ascii="Courier New" w:eastAsia="Times New Roman" w:hAnsi="Courier New" w:cs="Courier New"/>
+          <w:b/>
+          <w:bCs/>
+          <w:sz w:val="24"/>
+          <w:szCs w:val="24"/>
+        </w:rPr>
+        <w:t>Criterio:</w:t>
+      </w:r>
+      <w:r>
+        <w:rPr>
+          <w:rFonts w:ascii="Courier New" w:eastAsia="Times New Roman" w:hAnsi="Courier New" w:cs="Courier New"/>
+          <w:sz w:val="24"/>
+          <w:szCs w:val="24"/>
+        </w:rPr>
+        <w:br/>
+        <w:t>COBIT 2019, mediante el objetivo DSS04 (Continuidad gestionada), y COSO (Actividades de Control) requieren que la organización implemente salvaguardas para garantizar la disponibilidad continua de la información crítica y la capacidad de restauración en caso de incidentes.</w:t>
+      </w:r>
+    </w:p>
+    <w:p>
+      <w:pPr>
+        <w:spacing w:before="100" w:beforeAutospacing="1" w:after="100" w:afterAutospacing="1" w:line="240" w:lineRule="auto"/>
+        <w:outlineLvl w:val="2"/>
+        <w:rPr>
+          <w:rFonts w:ascii="Courier New" w:eastAsia="Times New Roman" w:hAnsi="Courier New" w:cs="Courier New"/>
+          <w:sz w:val="24"/>
+          <w:szCs w:val="24"/>
+        </w:rPr>
+      </w:pPr>
+      <w:r>
+        <w:rPr>
+          <w:rFonts w:ascii="Courier New" w:eastAsia="Times New Roman" w:hAnsi="Courier New" w:cs="Courier New"/>
+          <w:b/>
+          <w:bCs/>
+          <w:sz w:val="24"/>
+          <w:szCs w:val="24"/>
+        </w:rPr>
+        <w:t>Causa:</w:t>
+      </w:r>
+      <w:r>
+        <w:rPr>
+          <w:rFonts w:ascii="Courier New" w:eastAsia="Times New Roman" w:hAnsi="Courier New" w:cs="Courier New"/>
+          <w:sz w:val="24"/>
+          <w:szCs w:val="24"/>
+        </w:rPr>
+        <w:br/>
+        <w:t xml:space="preserve">Falta de concienciación de la Gerencia sobre el riesgo de pérdida total de datos. La implementación del sistema no incluyó la contratación de un servicio de </w:t>
+      </w:r>
+      <w:proofErr w:type="spellStart"/>
+      <w:r>
+        <w:rPr>
+          <w:rFonts w:ascii="Courier New" w:eastAsia="Times New Roman" w:hAnsi="Courier New" w:cs="Courier New"/>
+          <w:sz w:val="24"/>
+          <w:szCs w:val="24"/>
+        </w:rPr>
+        <w:t>backup</w:t>
+      </w:r>
+      <w:proofErr w:type="spellEnd"/>
+      <w:r>
+        <w:rPr>
+          <w:rFonts w:ascii="Courier New" w:eastAsia="Times New Roman" w:hAnsi="Courier New" w:cs="Courier New"/>
+          <w:sz w:val="24"/>
+          <w:szCs w:val="24"/>
+        </w:rPr>
+        <w:t xml:space="preserve"> ni la designación de un responsable para las tareas de respaldo y prueba de restauración.</w:t>
+      </w:r>
+    </w:p>
+    <w:p>
+      <w:pPr>
+        <w:spacing w:before="100" w:beforeAutospacing="1" w:after="100" w:afterAutospacing="1" w:line="240" w:lineRule="auto"/>
+        <w:outlineLvl w:val="2"/>
+        <w:rPr>
+          <w:rFonts w:ascii="Courier New" w:eastAsia="Times New Roman" w:hAnsi="Courier New" w:cs="Courier New"/>
+          <w:sz w:val="24"/>
+          <w:szCs w:val="24"/>
+        </w:rPr>
+      </w:pPr>
+      <w:r>
+        <w:rPr>
+          <w:rFonts w:ascii="Courier New" w:eastAsia="Times New Roman" w:hAnsi="Courier New" w:cs="Courier New"/>
+          <w:b/>
+          <w:bCs/>
+          <w:sz w:val="24"/>
+          <w:szCs w:val="24"/>
+        </w:rPr>
+        <w:t>Efecto:</w:t>
+      </w:r>
+      <w:r>
+        <w:rPr>
+          <w:rFonts w:ascii="Courier New" w:eastAsia="Times New Roman" w:hAnsi="Courier New" w:cs="Courier New"/>
+          <w:sz w:val="24"/>
+          <w:szCs w:val="24"/>
+        </w:rPr>
+        <w:br/>
+        <w:t xml:space="preserve">Alta probabilidad de pérdida definitiva de historiales de clientes, vehículos, facturación y órdenes de trabajo ante un fallo del servidor, incendio, robo o ataque informático. Esto causaría la paralización total del taller, pérdida financiera severa y daño </w:t>
+      </w:r>
+      <w:proofErr w:type="spellStart"/>
+      <w:r>
+        <w:rPr>
+          <w:rFonts w:ascii="Courier New" w:eastAsia="Times New Roman" w:hAnsi="Courier New" w:cs="Courier New"/>
+          <w:sz w:val="24"/>
+          <w:szCs w:val="24"/>
+        </w:rPr>
+        <w:t>reputacional</w:t>
+      </w:r>
+      <w:proofErr w:type="spellEnd"/>
+      <w:r>
+        <w:rPr>
+          <w:rFonts w:ascii="Courier New" w:eastAsia="Times New Roman" w:hAnsi="Courier New" w:cs="Courier New"/>
+          <w:sz w:val="24"/>
+          <w:szCs w:val="24"/>
+        </w:rPr>
+        <w:t xml:space="preserve"> irreversible.</w:t>
+      </w:r>
+    </w:p>
+    <w:p>
+      <w:pPr>
+        <w:spacing w:before="100" w:beforeAutospacing="1" w:after="100" w:afterAutospacing="1" w:line="240" w:lineRule="auto"/>
+        <w:outlineLvl w:val="2"/>
+        <w:rPr>
+          <w:rFonts w:ascii="Courier New" w:eastAsia="Times New Roman" w:hAnsi="Courier New" w:cs="Courier New"/>
+          <w:sz w:val="24"/>
+          <w:szCs w:val="24"/>
+        </w:rPr>
+      </w:pPr>
+      <w:r>
+        <w:rPr>
+          <w:rFonts w:ascii="Courier New" w:eastAsia="Times New Roman" w:hAnsi="Courier New" w:cs="Courier New"/>
+          <w:b/>
+          <w:bCs/>
+          <w:sz w:val="24"/>
+          <w:szCs w:val="24"/>
+        </w:rPr>
+        <w:t>Recomendación:</w:t>
+      </w:r>
+      <w:r>
+        <w:rPr>
+          <w:rFonts w:ascii="Courier New" w:eastAsia="Times New Roman" w:hAnsi="Courier New" w:cs="Courier New"/>
+          <w:sz w:val="24"/>
+          <w:szCs w:val="24"/>
+        </w:rPr>
+        <w:br/>
+        <w:t xml:space="preserve">Implementar un sistema de </w:t>
+      </w:r>
+      <w:proofErr w:type="spellStart"/>
+      <w:r>
+        <w:rPr>
+          <w:rFonts w:ascii="Courier New" w:eastAsia="Times New Roman" w:hAnsi="Courier New" w:cs="Courier New"/>
+          <w:sz w:val="24"/>
+          <w:szCs w:val="24"/>
+        </w:rPr>
+        <w:t>backup</w:t>
+      </w:r>
+      <w:proofErr w:type="spellEnd"/>
+      <w:r>
+        <w:rPr>
+          <w:rFonts w:ascii="Courier New" w:eastAsia="Times New Roman" w:hAnsi="Courier New" w:cs="Courier New"/>
+          <w:sz w:val="24"/>
+          <w:szCs w:val="24"/>
+        </w:rPr>
+        <w:t xml:space="preserve"> automático diario con copia almacenada en una ubicación externa (nube o servidor externo). Redactar, aprobar y probar semestralmente un Plan de Recuperación de Desastres (DRP) que detalle los pasos para restaurar el sistema en el menor tiempo posible. Asignar formalmente la responsabilidad de supervisar los respaldos.</w:t>
+      </w:r>
+    </w:p>
+    <w:p>
+      <w:pPr>
+        <w:spacing w:before="100" w:beforeAutospacing="1" w:after="100" w:afterAutospacing="1" w:line="240" w:lineRule="auto"/>
+        <w:outlineLvl w:val="2"/>
+        <w:rPr>
+          <w:rFonts w:ascii="Courier New" w:eastAsia="Times New Roman" w:hAnsi="Courier New" w:cs="Courier New"/>
+          <w:sz w:val="24"/>
+          <w:szCs w:val="24"/>
+        </w:rPr>
+      </w:pPr>
+      <w:r>
+        <w:rPr>
+          <w:rFonts w:ascii="Courier New" w:eastAsia="Times New Roman" w:hAnsi="Courier New" w:cs="Courier New"/>
+          <w:sz w:val="24"/>
+          <w:szCs w:val="24"/>
+        </w:rPr>
+        <w:pict>
+          <v:rect id="_x0000_i1026" style="width:0;height:.75pt" o:hralign="center" o:hrstd="t" o:hr="t" fillcolor="#a0a0a0" stroked="f"/>
+        </w:pict>
+      </w:r>
+    </w:p>
+    <w:p>
+      <w:pPr>
+        <w:spacing w:before="100" w:beforeAutospacing="1" w:after="100" w:afterAutospacing="1" w:line="240" w:lineRule="auto"/>
+        <w:outlineLvl w:val="2"/>
+        <w:rPr>
+          <w:rFonts w:ascii="Courier New" w:eastAsia="Times New Roman" w:hAnsi="Courier New" w:cs="Courier New"/>
+          <w:b/>
+          <w:bCs/>
+          <w:sz w:val="24"/>
+          <w:szCs w:val="24"/>
+        </w:rPr>
+      </w:pPr>
+      <w:r>
+        <w:rPr>
+          <w:rFonts w:ascii="Courier New" w:eastAsia="Times New Roman" w:hAnsi="Courier New" w:cs="Courier New"/>
+          <w:b/>
+          <w:bCs/>
+          <w:sz w:val="24"/>
+          <w:szCs w:val="24"/>
+        </w:rPr>
+        <w:t>Hallazgo No. 3: Ausencia de registros de auditoría (bitácoras de actividad)</w:t>
+      </w:r>
+    </w:p>
+    <w:p>
+      <w:pPr>
+        <w:spacing w:before="100" w:beforeAutospacing="1" w:after="100" w:afterAutospacing="1" w:line="240" w:lineRule="auto"/>
+        <w:outlineLvl w:val="2"/>
+        <w:rPr>
+          <w:rFonts w:ascii="Courier New" w:eastAsia="Times New Roman" w:hAnsi="Courier New" w:cs="Courier New"/>
+          <w:sz w:val="24"/>
+          <w:szCs w:val="24"/>
+        </w:rPr>
+      </w:pPr>
+      <w:r>
+        <w:rPr>
+          <w:rFonts w:ascii="Courier New" w:eastAsia="Times New Roman" w:hAnsi="Courier New" w:cs="Courier New"/>
+          <w:b/>
+          <w:bCs/>
+          <w:sz w:val="24"/>
+          <w:szCs w:val="24"/>
+        </w:rPr>
+        <w:t>Condición:</w:t>
+      </w:r>
+      <w:r>
+        <w:rPr>
+          <w:rFonts w:ascii="Courier New" w:eastAsia="Times New Roman" w:hAnsi="Courier New" w:cs="Courier New"/>
+          <w:sz w:val="24"/>
+          <w:szCs w:val="24"/>
+        </w:rPr>
+        <w:br/>
+        <w:t>El sistema no almacena bitácoras (</w:t>
+      </w:r>
+      <w:proofErr w:type="spellStart"/>
+      <w:r>
+        <w:rPr>
+          <w:rFonts w:ascii="Courier New" w:eastAsia="Times New Roman" w:hAnsi="Courier New" w:cs="Courier New"/>
+          <w:sz w:val="24"/>
+          <w:szCs w:val="24"/>
+        </w:rPr>
+        <w:t>logs</w:t>
+      </w:r>
+      <w:proofErr w:type="spellEnd"/>
+      <w:r>
+        <w:rPr>
+          <w:rFonts w:ascii="Courier New" w:eastAsia="Times New Roman" w:hAnsi="Courier New" w:cs="Courier New"/>
+          <w:sz w:val="24"/>
+          <w:szCs w:val="24"/>
+        </w:rPr>
+        <w:t>) que registren quién, cuándo y qué modificaciones realizó sobre datos críticos. Tampoco se revisan periódicamente los accesos al sistema.</w:t>
+      </w:r>
+    </w:p>
+    <w:p>
+      <w:pPr>
+        <w:spacing w:before="100" w:beforeAutospacing="1" w:after="100" w:afterAutospacing="1" w:line="240" w:lineRule="auto"/>
+        <w:outlineLvl w:val="2"/>
+        <w:rPr>
+          <w:rFonts w:ascii="Courier New" w:eastAsia="Times New Roman" w:hAnsi="Courier New" w:cs="Courier New"/>
+          <w:sz w:val="24"/>
+          <w:szCs w:val="24"/>
+        </w:rPr>
+      </w:pPr>
+      <w:r>
+        <w:rPr>
+          <w:rFonts w:ascii="Courier New" w:eastAsia="Times New Roman" w:hAnsi="Courier New" w:cs="Courier New"/>
+          <w:b/>
+          <w:bCs/>
+          <w:sz w:val="24"/>
+          <w:szCs w:val="24"/>
+        </w:rPr>
+        <w:lastRenderedPageBreak/>
+        <w:t>Criterio:</w:t>
+      </w:r>
+      <w:r>
+        <w:rPr>
+          <w:rFonts w:ascii="Courier New" w:eastAsia="Times New Roman" w:hAnsi="Courier New" w:cs="Courier New"/>
+          <w:sz w:val="24"/>
+          <w:szCs w:val="24"/>
+        </w:rPr>
+        <w:br/>
+        <w:t>COBIT 2019 (MEA02 – Monitoreo del sistema de control interno) y COSO (Monitoreo e Información y Comunicación) indican que los sistemas deben generar registros de auditoría que permitan el seguimiento de las actividades de los usuarios, facilitando la detección de anomalías y la rendición de cuentas.</w:t>
+      </w:r>
+    </w:p>
+    <w:p>
+      <w:pPr>
+        <w:spacing w:before="100" w:beforeAutospacing="1" w:after="100" w:afterAutospacing="1" w:line="240" w:lineRule="auto"/>
+        <w:outlineLvl w:val="2"/>
+        <w:rPr>
+          <w:rFonts w:ascii="Courier New" w:eastAsia="Times New Roman" w:hAnsi="Courier New" w:cs="Courier New"/>
+          <w:sz w:val="24"/>
+          <w:szCs w:val="24"/>
+        </w:rPr>
+      </w:pPr>
+      <w:r>
+        <w:rPr>
+          <w:rFonts w:ascii="Courier New" w:eastAsia="Times New Roman" w:hAnsi="Courier New" w:cs="Courier New"/>
+          <w:b/>
+          <w:bCs/>
+          <w:sz w:val="24"/>
+          <w:szCs w:val="24"/>
+        </w:rPr>
+        <w:t>Causa:</w:t>
+      </w:r>
+      <w:r>
+        <w:rPr>
+          <w:rFonts w:ascii="Courier New" w:eastAsia="Times New Roman" w:hAnsi="Courier New" w:cs="Courier New"/>
+          <w:sz w:val="24"/>
+          <w:szCs w:val="24"/>
+        </w:rPr>
+        <w:br/>
+        <w:t>La funcionalidad de auditoría del sistema no fue activada durante la puesta en marcha. No se ha definido un procedimiento para la revisión de la actividad de los usuarios ni se ha asignado a un encargado de seguridad.</w:t>
+      </w:r>
+    </w:p>
+    <w:p>
+      <w:pPr>
+        <w:spacing w:before="100" w:beforeAutospacing="1" w:after="100" w:afterAutospacing="1" w:line="240" w:lineRule="auto"/>
+        <w:outlineLvl w:val="2"/>
+        <w:rPr>
+          <w:rFonts w:ascii="Courier New" w:eastAsia="Times New Roman" w:hAnsi="Courier New" w:cs="Courier New"/>
+          <w:sz w:val="24"/>
+          <w:szCs w:val="24"/>
+        </w:rPr>
+      </w:pPr>
+      <w:r>
+        <w:rPr>
+          <w:rFonts w:ascii="Courier New" w:eastAsia="Times New Roman" w:hAnsi="Courier New" w:cs="Courier New"/>
+          <w:b/>
+          <w:bCs/>
+          <w:sz w:val="24"/>
+          <w:szCs w:val="24"/>
+        </w:rPr>
+        <w:t>Efecto:</w:t>
+      </w:r>
+      <w:r>
+        <w:rPr>
+          <w:rFonts w:ascii="Courier New" w:eastAsia="Times New Roman" w:hAnsi="Courier New" w:cs="Courier New"/>
+          <w:sz w:val="24"/>
+          <w:szCs w:val="24"/>
+        </w:rPr>
+        <w:br/>
+        <w:t>Imposibilidad de investigar incidentes de seguridad, errores operativos o intentos de fraude. Se incumple el principio de integridad de la información y se debilita la capacidad de demostrar el cumplimiento de los contratos de servicio en caso de disputa legal.</w:t>
+      </w:r>
+    </w:p>
+    <w:p>
+      <w:pPr>
+        <w:spacing w:before="100" w:beforeAutospacing="1" w:after="100" w:afterAutospacing="1" w:line="240" w:lineRule="auto"/>
+        <w:outlineLvl w:val="2"/>
+        <w:rPr>
+          <w:rFonts w:ascii="Courier New" w:eastAsia="Times New Roman" w:hAnsi="Courier New" w:cs="Courier New"/>
+          <w:sz w:val="24"/>
+          <w:szCs w:val="24"/>
+        </w:rPr>
+      </w:pPr>
+      <w:r>
+        <w:rPr>
+          <w:rFonts w:ascii="Courier New" w:eastAsia="Times New Roman" w:hAnsi="Courier New" w:cs="Courier New"/>
+          <w:b/>
+          <w:bCs/>
+          <w:sz w:val="24"/>
+          <w:szCs w:val="24"/>
+        </w:rPr>
+        <w:t>Recomendación:</w:t>
+      </w:r>
+      <w:r>
+        <w:rPr>
+          <w:rFonts w:ascii="Courier New" w:eastAsia="Times New Roman" w:hAnsi="Courier New" w:cs="Courier New"/>
+          <w:sz w:val="24"/>
+          <w:szCs w:val="24"/>
+        </w:rPr>
+        <w:br/>
+        <w:t xml:space="preserve">Activar el registro de auditoría del sistema, configurándolo para que capture al menos: inicio de sesión (exitosos y fallidos), creación/modificación/eliminación de órdenes y facturas, y cambios en datos maestros. Establecer una revisión trimestral de estos </w:t>
+      </w:r>
+      <w:proofErr w:type="spellStart"/>
+      <w:r>
+        <w:rPr>
+          <w:rFonts w:ascii="Courier New" w:eastAsia="Times New Roman" w:hAnsi="Courier New" w:cs="Courier New"/>
+          <w:sz w:val="24"/>
+          <w:szCs w:val="24"/>
+        </w:rPr>
+        <w:t>logs</w:t>
+      </w:r>
+      <w:proofErr w:type="spellEnd"/>
+      <w:r>
+        <w:rPr>
+          <w:rFonts w:ascii="Courier New" w:eastAsia="Times New Roman" w:hAnsi="Courier New" w:cs="Courier New"/>
+          <w:sz w:val="24"/>
+          <w:szCs w:val="24"/>
+        </w:rPr>
+        <w:t xml:space="preserve"> por parte del Gerente o un encargado de control interno, documentando los hallazgos.</w:t>
+      </w:r>
+    </w:p>
+    <w:p>
+      <w:pPr>
+        <w:spacing w:before="100" w:beforeAutospacing="1" w:after="100" w:afterAutospacing="1" w:line="240" w:lineRule="auto"/>
+        <w:outlineLvl w:val="2"/>
+        <w:rPr>
+          <w:rFonts w:ascii="Courier New" w:eastAsia="Times New Roman" w:hAnsi="Courier New" w:cs="Courier New"/>
+          <w:b/>
+          <w:bCs/>
+          <w:sz w:val="27"/>
+          <w:szCs w:val="27"/>
+        </w:rPr>
+      </w:pPr>
+    </w:p>
+    <w:p>
+      <w:pPr>
+        <w:spacing w:before="100" w:beforeAutospacing="1" w:after="100" w:afterAutospacing="1" w:line="240" w:lineRule="auto"/>
+        <w:outlineLvl w:val="2"/>
+        <w:rPr>
+          <w:rFonts w:ascii="Courier New" w:eastAsia="Times New Roman" w:hAnsi="Courier New" w:cs="Courier New"/>
+          <w:b/>
+          <w:bCs/>
+          <w:sz w:val="27"/>
+          <w:szCs w:val="27"/>
+        </w:rPr>
+      </w:pPr>
+      <w:r>
+        <w:rPr>
+          <w:rFonts w:ascii="Courier New" w:eastAsia="Times New Roman" w:hAnsi="Courier New" w:cs="Courier New"/>
+          <w:b/>
+          <w:bCs/>
+          <w:sz w:val="27"/>
+          <w:szCs w:val="27"/>
+        </w:rPr>
+        <w:t>ACTIVIDAD 9. ELABORACIÓN DE MATRIZ DE HALLAZGOS Y PLAN DE MEJORA</w:t>
+      </w:r>
+    </w:p>
+    <w:p>
+      <w:pPr>
+        <w:spacing w:before="100" w:beforeAutospacing="1" w:after="100" w:afterAutospacing="1" w:line="240" w:lineRule="auto"/>
+        <w:outlineLvl w:val="2"/>
+        <w:rPr>
+          <w:rFonts w:ascii="Courier New" w:eastAsia="Times New Roman" w:hAnsi="Courier New" w:cs="Courier New"/>
+          <w:bCs/>
+          <w:sz w:val="27"/>
+          <w:szCs w:val="27"/>
+        </w:rPr>
+      </w:pPr>
+      <w:r>
+        <w:rPr>
+          <w:rFonts w:ascii="Courier New" w:eastAsia="Times New Roman" w:hAnsi="Courier New" w:cs="Courier New"/>
+          <w:bCs/>
+          <w:sz w:val="27"/>
+          <w:szCs w:val="27"/>
+        </w:rPr>
+        <w:t>Hallazgo</w:t>
+      </w:r>
+      <w:r>
+        <w:rPr>
+          <w:rFonts w:ascii="Courier New" w:eastAsia="Times New Roman" w:hAnsi="Courier New" w:cs="Courier New"/>
+          <w:bCs/>
+          <w:sz w:val="27"/>
+          <w:szCs w:val="27"/>
+        </w:rPr>
+        <w:tab/>
+        <w:t>Riesgo</w:t>
+      </w:r>
+      <w:r>
+        <w:rPr>
+          <w:rFonts w:ascii="Courier New" w:eastAsia="Times New Roman" w:hAnsi="Courier New" w:cs="Courier New"/>
+          <w:bCs/>
+          <w:sz w:val="27"/>
+          <w:szCs w:val="27"/>
+        </w:rPr>
+        <w:tab/>
+        <w:t>Recomendación</w:t>
+      </w:r>
+      <w:r>
+        <w:rPr>
+          <w:rFonts w:ascii="Courier New" w:eastAsia="Times New Roman" w:hAnsi="Courier New" w:cs="Courier New"/>
+          <w:bCs/>
+          <w:sz w:val="27"/>
+          <w:szCs w:val="27"/>
+        </w:rPr>
+        <w:tab/>
+        <w:t>Responsable</w:t>
+      </w:r>
+      <w:r>
+        <w:rPr>
+          <w:rFonts w:ascii="Courier New" w:eastAsia="Times New Roman" w:hAnsi="Courier New" w:cs="Courier New"/>
+          <w:bCs/>
+          <w:sz w:val="27"/>
+          <w:szCs w:val="27"/>
+        </w:rPr>
+        <w:tab/>
+        <w:t>Prioridad</w:t>
+      </w:r>
+    </w:p>
+    <w:p>
+      <w:pPr>
+        <w:spacing w:before="100" w:beforeAutospacing="1" w:after="100" w:afterAutospacing="1" w:line="240" w:lineRule="auto"/>
+        <w:outlineLvl w:val="2"/>
+        <w:rPr>
+          <w:rFonts w:ascii="Courier New" w:eastAsia="Times New Roman" w:hAnsi="Courier New" w:cs="Courier New"/>
+          <w:bCs/>
+          <w:sz w:val="27"/>
+          <w:szCs w:val="27"/>
+        </w:rPr>
+      </w:pPr>
+      <w:r>
+        <w:rPr>
+          <w:rFonts w:ascii="Courier New" w:eastAsia="Times New Roman" w:hAnsi="Courier New" w:cs="Courier New"/>
+          <w:bCs/>
+          <w:sz w:val="27"/>
+          <w:szCs w:val="27"/>
+        </w:rPr>
+        <w:t>1. Uso de contraseñas compartidas y perfiles no individualizados.</w:t>
+      </w:r>
+      <w:r>
+        <w:rPr>
+          <w:rFonts w:ascii="Courier New" w:eastAsia="Times New Roman" w:hAnsi="Courier New" w:cs="Courier New"/>
+          <w:bCs/>
+          <w:sz w:val="27"/>
+          <w:szCs w:val="27"/>
+        </w:rPr>
+        <w:tab/>
+        <w:t>Suplantación de identidad, modificación no autorizada de datos, imposibilidad de rendición de cuentas.</w:t>
+      </w:r>
+      <w:r>
+        <w:rPr>
+          <w:rFonts w:ascii="Courier New" w:eastAsia="Times New Roman" w:hAnsi="Courier New" w:cs="Courier New"/>
+          <w:bCs/>
+          <w:sz w:val="27"/>
+          <w:szCs w:val="27"/>
+        </w:rPr>
+        <w:tab/>
+        <w:t>Crear cuentas de usuario individuales con roles según el puesto; exigir cambio de contraseña en el primer acceso y caducidad periódica.</w:t>
+      </w:r>
+      <w:r>
+        <w:rPr>
+          <w:rFonts w:ascii="Courier New" w:eastAsia="Times New Roman" w:hAnsi="Courier New" w:cs="Courier New"/>
+          <w:bCs/>
+          <w:sz w:val="27"/>
+          <w:szCs w:val="27"/>
+        </w:rPr>
+        <w:tab/>
+        <w:t>Administrador del sistema (o Gerente en ausencia de TI)</w:t>
+      </w:r>
+      <w:r>
+        <w:rPr>
+          <w:rFonts w:ascii="Courier New" w:eastAsia="Times New Roman" w:hAnsi="Courier New" w:cs="Courier New"/>
+          <w:bCs/>
+          <w:sz w:val="27"/>
+          <w:szCs w:val="27"/>
+        </w:rPr>
+        <w:tab/>
+        <w:t>Alta</w:t>
+      </w:r>
+    </w:p>
+    <w:p>
+      <w:pPr>
+        <w:spacing w:before="100" w:beforeAutospacing="1" w:after="100" w:afterAutospacing="1" w:line="240" w:lineRule="auto"/>
+        <w:outlineLvl w:val="2"/>
+        <w:rPr>
+          <w:rFonts w:ascii="Courier New" w:eastAsia="Times New Roman" w:hAnsi="Courier New" w:cs="Courier New"/>
+          <w:bCs/>
+          <w:sz w:val="27"/>
+          <w:szCs w:val="27"/>
+        </w:rPr>
+      </w:pPr>
+      <w:r>
+        <w:rPr>
+          <w:rFonts w:ascii="Courier New" w:eastAsia="Times New Roman" w:hAnsi="Courier New" w:cs="Courier New"/>
+          <w:bCs/>
+          <w:sz w:val="27"/>
+          <w:szCs w:val="27"/>
+        </w:rPr>
+        <w:t>2. Inexistencia de copias de seguridad automáticas y plan de recuperación.</w:t>
+      </w:r>
+      <w:r>
+        <w:rPr>
+          <w:rFonts w:ascii="Courier New" w:eastAsia="Times New Roman" w:hAnsi="Courier New" w:cs="Courier New"/>
+          <w:bCs/>
+          <w:sz w:val="27"/>
+          <w:szCs w:val="27"/>
+        </w:rPr>
+        <w:tab/>
+        <w:t xml:space="preserve">Pérdida total e irreversible de la </w:t>
+      </w:r>
+      <w:r>
+        <w:rPr>
+          <w:rFonts w:ascii="Courier New" w:eastAsia="Times New Roman" w:hAnsi="Courier New" w:cs="Courier New"/>
+          <w:bCs/>
+          <w:sz w:val="27"/>
+          <w:szCs w:val="27"/>
+        </w:rPr>
+        <w:lastRenderedPageBreak/>
+        <w:t>información crítica; paralización completa del negocio ante cualquier siniestro.</w:t>
+      </w:r>
+      <w:r>
+        <w:rPr>
+          <w:rFonts w:ascii="Courier New" w:eastAsia="Times New Roman" w:hAnsi="Courier New" w:cs="Courier New"/>
+          <w:bCs/>
+          <w:sz w:val="27"/>
+          <w:szCs w:val="27"/>
+        </w:rPr>
+        <w:tab/>
+        <w:t xml:space="preserve">Implementar </w:t>
+      </w:r>
+      <w:proofErr w:type="spellStart"/>
+      <w:r>
+        <w:rPr>
+          <w:rFonts w:ascii="Courier New" w:eastAsia="Times New Roman" w:hAnsi="Courier New" w:cs="Courier New"/>
+          <w:bCs/>
+          <w:sz w:val="27"/>
+          <w:szCs w:val="27"/>
+        </w:rPr>
+        <w:t>backup</w:t>
+      </w:r>
+      <w:proofErr w:type="spellEnd"/>
+      <w:r>
+        <w:rPr>
+          <w:rFonts w:ascii="Courier New" w:eastAsia="Times New Roman" w:hAnsi="Courier New" w:cs="Courier New"/>
+          <w:bCs/>
+          <w:sz w:val="27"/>
+          <w:szCs w:val="27"/>
+        </w:rPr>
+        <w:t xml:space="preserve"> diario automático en ubicación externa; redactar y </w:t>
+      </w:r>
+      <w:proofErr w:type="spellStart"/>
+      <w:r>
+        <w:rPr>
+          <w:rFonts w:ascii="Courier New" w:eastAsia="Times New Roman" w:hAnsi="Courier New" w:cs="Courier New"/>
+          <w:bCs/>
+          <w:sz w:val="27"/>
+          <w:szCs w:val="27"/>
+        </w:rPr>
+        <w:t>probar</w:t>
+      </w:r>
+      <w:proofErr w:type="spellEnd"/>
+      <w:r>
+        <w:rPr>
+          <w:rFonts w:ascii="Courier New" w:eastAsia="Times New Roman" w:hAnsi="Courier New" w:cs="Courier New"/>
+          <w:bCs/>
+          <w:sz w:val="27"/>
+          <w:szCs w:val="27"/>
+        </w:rPr>
+        <w:t xml:space="preserve"> un Plan de Recuperación de Desastres (DRP).</w:t>
+      </w:r>
+      <w:r>
+        <w:rPr>
+          <w:rFonts w:ascii="Courier New" w:eastAsia="Times New Roman" w:hAnsi="Courier New" w:cs="Courier New"/>
+          <w:bCs/>
+          <w:sz w:val="27"/>
+          <w:szCs w:val="27"/>
+        </w:rPr>
+        <w:tab/>
+        <w:t>Gerente General / Responsable administrativo</w:t>
+      </w:r>
+      <w:r>
+        <w:rPr>
+          <w:rFonts w:ascii="Courier New" w:eastAsia="Times New Roman" w:hAnsi="Courier New" w:cs="Courier New"/>
+          <w:bCs/>
+          <w:sz w:val="27"/>
+          <w:szCs w:val="27"/>
+        </w:rPr>
+        <w:tab/>
+        <w:t>Alta</w:t>
+      </w:r>
+    </w:p>
+    <w:p>
+      <w:pPr>
+        <w:spacing w:before="100" w:beforeAutospacing="1" w:after="100" w:afterAutospacing="1" w:line="240" w:lineRule="auto"/>
+        <w:outlineLvl w:val="2"/>
+        <w:rPr>
+          <w:rFonts w:ascii="Courier New" w:eastAsia="Times New Roman" w:hAnsi="Courier New" w:cs="Courier New"/>
+          <w:bCs/>
+          <w:sz w:val="27"/>
+          <w:szCs w:val="27"/>
+        </w:rPr>
+      </w:pPr>
+      <w:r>
+        <w:rPr>
+          <w:rFonts w:ascii="Courier New" w:eastAsia="Times New Roman" w:hAnsi="Courier New" w:cs="Courier New"/>
+          <w:bCs/>
+          <w:sz w:val="27"/>
+          <w:szCs w:val="27"/>
+        </w:rPr>
+        <w:t>3. Falta de registros de auditoría (bitácoras) y monitoreo de accesos.</w:t>
+      </w:r>
+      <w:r>
+        <w:rPr>
+          <w:rFonts w:ascii="Courier New" w:eastAsia="Times New Roman" w:hAnsi="Courier New" w:cs="Courier New"/>
+          <w:bCs/>
+          <w:sz w:val="27"/>
+          <w:szCs w:val="27"/>
+        </w:rPr>
+        <w:tab/>
+        <w:t>Imposibilidad de detectar fraudes o errores; incumplimiento de requisitos de integridad; falta de evidencia ante disputas.</w:t>
+      </w:r>
+      <w:r>
+        <w:rPr>
+          <w:rFonts w:ascii="Courier New" w:eastAsia="Times New Roman" w:hAnsi="Courier New" w:cs="Courier New"/>
+          <w:bCs/>
+          <w:sz w:val="27"/>
+          <w:szCs w:val="27"/>
+        </w:rPr>
+        <w:tab/>
+        <w:t xml:space="preserve">Activar la funcionalidad de </w:t>
+      </w:r>
+      <w:proofErr w:type="spellStart"/>
+      <w:r>
+        <w:rPr>
+          <w:rFonts w:ascii="Courier New" w:eastAsia="Times New Roman" w:hAnsi="Courier New" w:cs="Courier New"/>
+          <w:bCs/>
+          <w:sz w:val="27"/>
+          <w:szCs w:val="27"/>
+        </w:rPr>
+        <w:t>logs</w:t>
+      </w:r>
+      <w:proofErr w:type="spellEnd"/>
+      <w:r>
+        <w:rPr>
+          <w:rFonts w:ascii="Courier New" w:eastAsia="Times New Roman" w:hAnsi="Courier New" w:cs="Courier New"/>
+          <w:bCs/>
+          <w:sz w:val="27"/>
+          <w:szCs w:val="27"/>
+        </w:rPr>
+        <w:t xml:space="preserve"> del sistema; realizar revisiones trimestrales de eventos críticos y de los permisos de usuarios.</w:t>
+      </w:r>
+      <w:r>
+        <w:rPr>
+          <w:rFonts w:ascii="Courier New" w:eastAsia="Times New Roman" w:hAnsi="Courier New" w:cs="Courier New"/>
+          <w:bCs/>
+          <w:sz w:val="27"/>
+          <w:szCs w:val="27"/>
+        </w:rPr>
+        <w:tab/>
+        <w:t>Gerente General</w:t>
+      </w:r>
+      <w:r>
+        <w:rPr>
+          <w:rFonts w:ascii="Courier New" w:eastAsia="Times New Roman" w:hAnsi="Courier New" w:cs="Courier New"/>
+          <w:bCs/>
+          <w:sz w:val="27"/>
+          <w:szCs w:val="27"/>
+        </w:rPr>
+        <w:tab/>
+        <w:t>Alta</w:t>
+      </w:r>
+    </w:p>
+    <w:p>
+      <w:pPr>
+        <w:spacing w:before="100" w:beforeAutospacing="1" w:after="100" w:afterAutospacing="1" w:line="240" w:lineRule="auto"/>
+        <w:outlineLvl w:val="2"/>
+        <w:rPr>
+          <w:rFonts w:ascii="Courier New" w:eastAsia="Times New Roman" w:hAnsi="Courier New" w:cs="Courier New"/>
+          <w:bCs/>
+          <w:sz w:val="27"/>
+          <w:szCs w:val="27"/>
+        </w:rPr>
+      </w:pPr>
+      <w:r>
+        <w:rPr>
+          <w:rFonts w:ascii="Courier New" w:eastAsia="Times New Roman" w:hAnsi="Courier New" w:cs="Courier New"/>
+          <w:bCs/>
+          <w:sz w:val="27"/>
+          <w:szCs w:val="27"/>
+        </w:rPr>
+        <w:t>4. Inexistencia de una política de seguridad de la información documentada.</w:t>
+      </w:r>
+      <w:r>
+        <w:rPr>
+          <w:rFonts w:ascii="Courier New" w:eastAsia="Times New Roman" w:hAnsi="Courier New" w:cs="Courier New"/>
+          <w:bCs/>
+          <w:sz w:val="27"/>
+          <w:szCs w:val="27"/>
+        </w:rPr>
+        <w:tab/>
+        <w:t>El personal desconoce sus obligaciones; los controles se aplican de manera informal y no son exigibles; incumplimientos sin consecuencias.</w:t>
+      </w:r>
+      <w:r>
+        <w:rPr>
+          <w:rFonts w:ascii="Courier New" w:eastAsia="Times New Roman" w:hAnsi="Courier New" w:cs="Courier New"/>
+          <w:bCs/>
+          <w:sz w:val="27"/>
+          <w:szCs w:val="27"/>
+        </w:rPr>
+        <w:tab/>
+        <w:t>Redactar una política sencilla que cubra manejo de contraseñas, uso del sistema, respaldo, confidencialidad y sanciones; difundirla a todo el personal.</w:t>
+      </w:r>
+      <w:r>
+        <w:rPr>
+          <w:rFonts w:ascii="Courier New" w:eastAsia="Times New Roman" w:hAnsi="Courier New" w:cs="Courier New"/>
+          <w:bCs/>
+          <w:sz w:val="27"/>
+          <w:szCs w:val="27"/>
+        </w:rPr>
+        <w:tab/>
+        <w:t>Gerente General (con asesoría si es necesario)</w:t>
+      </w:r>
+      <w:r>
+        <w:rPr>
+          <w:rFonts w:ascii="Courier New" w:eastAsia="Times New Roman" w:hAnsi="Courier New" w:cs="Courier New"/>
+          <w:bCs/>
+          <w:sz w:val="27"/>
+          <w:szCs w:val="27"/>
+        </w:rPr>
+        <w:tab/>
+        <w:t>Media</w:t>
+      </w:r>
+    </w:p>
+    <w:p>
+      <w:pPr>
+        <w:spacing w:before="100" w:beforeAutospacing="1" w:after="100" w:afterAutospacing="1" w:line="240" w:lineRule="auto"/>
+        <w:outlineLvl w:val="2"/>
+        <w:rPr>
+          <w:rFonts w:ascii="Courier New" w:eastAsia="Times New Roman" w:hAnsi="Courier New" w:cs="Courier New"/>
+          <w:bCs/>
+          <w:sz w:val="27"/>
+          <w:szCs w:val="27"/>
+        </w:rPr>
+      </w:pPr>
+      <w:r>
+        <w:rPr>
+          <w:rFonts w:ascii="Courier New" w:eastAsia="Times New Roman" w:hAnsi="Courier New" w:cs="Courier New"/>
+          <w:bCs/>
+          <w:sz w:val="27"/>
+          <w:szCs w:val="27"/>
+        </w:rPr>
+        <w:t>5. Monitoreo insuficiente de los indicadores de desempeño del negocio (</w:t>
+      </w:r>
+      <w:proofErr w:type="spellStart"/>
+      <w:r>
+        <w:rPr>
+          <w:rFonts w:ascii="Courier New" w:eastAsia="Times New Roman" w:hAnsi="Courier New" w:cs="Courier New"/>
+          <w:bCs/>
+          <w:sz w:val="27"/>
+          <w:szCs w:val="27"/>
+        </w:rPr>
+        <w:t>KPIs</w:t>
+      </w:r>
+      <w:proofErr w:type="spellEnd"/>
+      <w:r>
+        <w:rPr>
+          <w:rFonts w:ascii="Courier New" w:eastAsia="Times New Roman" w:hAnsi="Courier New" w:cs="Courier New"/>
+          <w:bCs/>
+          <w:sz w:val="27"/>
+          <w:szCs w:val="27"/>
+        </w:rPr>
+        <w:t>).</w:t>
+      </w:r>
+      <w:r>
+        <w:rPr>
+          <w:rFonts w:ascii="Courier New" w:eastAsia="Times New Roman" w:hAnsi="Courier New" w:cs="Courier New"/>
+          <w:bCs/>
+          <w:sz w:val="27"/>
+          <w:szCs w:val="27"/>
+        </w:rPr>
+        <w:tab/>
+        <w:t>Aunque el sistema genera indicadores, la Gerencia no los revisa periódicamente; se pierden oportunidades de mejora y no se mide el retorno real de la inversión.</w:t>
+      </w:r>
+      <w:r>
+        <w:rPr>
+          <w:rFonts w:ascii="Courier New" w:eastAsia="Times New Roman" w:hAnsi="Courier New" w:cs="Courier New"/>
+          <w:bCs/>
+          <w:sz w:val="27"/>
+          <w:szCs w:val="27"/>
+        </w:rPr>
+        <w:tab/>
+        <w:t xml:space="preserve">Instituir una reunión mensual de revisión de </w:t>
+      </w:r>
+      <w:proofErr w:type="spellStart"/>
+      <w:r>
+        <w:rPr>
+          <w:rFonts w:ascii="Courier New" w:eastAsia="Times New Roman" w:hAnsi="Courier New" w:cs="Courier New"/>
+          <w:bCs/>
+          <w:sz w:val="27"/>
+          <w:szCs w:val="27"/>
+        </w:rPr>
+        <w:t>KPIs</w:t>
+      </w:r>
+      <w:proofErr w:type="spellEnd"/>
+      <w:r>
+        <w:rPr>
+          <w:rFonts w:ascii="Courier New" w:eastAsia="Times New Roman" w:hAnsi="Courier New" w:cs="Courier New"/>
+          <w:bCs/>
+          <w:sz w:val="27"/>
+          <w:szCs w:val="27"/>
+        </w:rPr>
+        <w:t xml:space="preserve"> (tiempos, satisfacción, productividad) con los encargados de área, usando los reportes del sistema para tomar acciones correctivas.</w:t>
+      </w:r>
+      <w:r>
+        <w:rPr>
+          <w:rFonts w:ascii="Courier New" w:eastAsia="Times New Roman" w:hAnsi="Courier New" w:cs="Courier New"/>
+          <w:bCs/>
+          <w:sz w:val="27"/>
+          <w:szCs w:val="27"/>
+        </w:rPr>
+        <w:tab/>
+        <w:t>Gerente General</w:t>
+      </w:r>
+      <w:r>
+        <w:rPr>
+          <w:rFonts w:ascii="Courier New" w:eastAsia="Times New Roman" w:hAnsi="Courier New" w:cs="Courier New"/>
+          <w:bCs/>
+          <w:sz w:val="27"/>
+          <w:szCs w:val="27"/>
+        </w:rPr>
+        <w:tab/>
+      </w:r>
+      <w:bookmarkStart w:id="0" w:name="_GoBack"/>
+      <w:bookmarkEnd w:id="0"/>
+    </w:p>
+    <w:p>
+      <w:pPr>
+        <w:shd w:val="clear" w:color="auto" w:fill="66CCFF"/>
+        <w:spacing w:before="100" w:beforeAutospacing="1" w:after="100" w:afterAutospacing="1" w:line="240" w:lineRule="auto"/>
+        <w:jc w:val="both"/>
+        <w:rPr>
+          <w:rFonts w:ascii="Courier New" w:eastAsia="Times New Roman" w:hAnsi="Courier New" w:cs="Courier New"/>
+          <w:color w:val="002060"/>
+          <w:sz w:val="24"/>
+          <w:szCs w:val="24"/>
+          <w:lang w:val="es-ES"/>
+        </w:rPr>
+      </w:pPr>
+      <w:r>
+        <w:rPr>
+          <w:rFonts w:ascii="Courier New" w:eastAsia="Times New Roman" w:hAnsi="Courier New" w:cs="Courier New"/>
+          <w:color w:val="002060"/>
+          <w:sz w:val="24"/>
+          <w:szCs w:val="24"/>
+        </w:rPr>
+        <w:t xml:space="preserve">Esta actividad acerca la práctica a una auditoría profesional real basada en COBIT 2019, permitiendo evaluar no solo controles </w:t>
+      </w:r>
+      <w:proofErr w:type="gramStart"/>
+      <w:r>
+        <w:rPr>
+          <w:rFonts w:ascii="Courier New" w:eastAsia="Times New Roman" w:hAnsi="Courier New" w:cs="Courier New"/>
+          <w:color w:val="002060"/>
+          <w:sz w:val="24"/>
+          <w:szCs w:val="24"/>
+        </w:rPr>
+        <w:t>y</w:t>
+      </w:r>
+      <w:proofErr w:type="gramEnd"/>
+      <w:r>
+        <w:rPr>
+          <w:rFonts w:ascii="Courier New" w:eastAsia="Times New Roman" w:hAnsi="Courier New" w:cs="Courier New"/>
+          <w:color w:val="002060"/>
+          <w:sz w:val="24"/>
+          <w:szCs w:val="24"/>
+        </w:rPr>
+        <w:t xml:space="preserve"> cumplimiento (MEA01, MEA02 y MEA03), sino también la generación de valor, alineación estratégica y beneficios obtenidos por el sistema implementado.</w:t>
+      </w:r>
+    </w:p>
+    <w:p>
+      <w:pPr>
+        <w:spacing w:before="100" w:beforeAutospacing="1" w:after="100" w:afterAutospacing="1" w:line="240" w:lineRule="auto"/>
+        <w:rPr>
+          <w:rFonts w:ascii="Courier New" w:eastAsia="Times New Roman" w:hAnsi="Courier New" w:cs="Courier New"/>
+          <w:sz w:val="24"/>
+          <w:szCs w:val="24"/>
+        </w:rPr>
+      </w:pPr>
+    </w:p>
+    <w:p>
+      <w:pPr>
+        <w:spacing w:before="100" w:beforeAutospacing="1" w:after="100" w:afterAutospacing="1" w:line="240" w:lineRule="auto"/>
+      </w:pPr>
+    </w:p>
     <w:sectPr>
       <w:pgSz w:w="12240" w:h="15840"/>
       <w:pgMar w:top="1440" w:right="1440" w:bottom="1440" w:left="1440" w:header="720" w:footer="720" w:gutter="0"/>
@@ -13677,6 +15831,155 @@
     </w:lvl>
   </w:abstractNum>
   <w:abstractNum w:abstractNumId="8">
+    <w:nsid w:val="1D7E3250"/>
+    <w:multiLevelType w:val="multilevel"/>
+    <w:tmpl w:val="A78C4BC8"/>
+    <w:lvl w:ilvl="0">
+      <w:start w:val="1"/>
+      <w:numFmt w:val="bullet"/>
+      <w:lvlText w:val=""/>
+      <w:lvlJc w:val="left"/>
+      <w:pPr>
+        <w:tabs>
+          <w:tab w:val="num" w:pos="720"/>
+        </w:tabs>
+        <w:ind w:left="720" w:hanging="360"/>
+      </w:pPr>
+      <w:rPr>
+        <w:rFonts w:ascii="Symbol" w:hAnsi="Symbol" w:hint="default"/>
+        <w:sz w:val="20"/>
+      </w:rPr>
+    </w:lvl>
+    <w:lvl w:ilvl="1">
+      <w:start w:val="1"/>
+      <w:numFmt w:val="bullet"/>
+      <w:lvlText w:val="o"/>
+      <w:lvlJc w:val="left"/>
+      <w:pPr>
+        <w:tabs>
+          <w:tab w:val="num" w:pos="1440"/>
+        </w:tabs>
+        <w:ind w:left="1440" w:hanging="360"/>
+      </w:pPr>
+      <w:rPr>
+        <w:rFonts w:ascii="Courier New" w:hAnsi="Courier New" w:cs="Times New Roman" w:hint="default"/>
+        <w:sz w:val="20"/>
+      </w:rPr>
+    </w:lvl>
+    <w:lvl w:ilvl="2">
+      <w:start w:val="1"/>
+      <w:numFmt w:val="bullet"/>
+      <w:lvlText w:val=""/>
+      <w:lvlJc w:val="left"/>
+      <w:pPr>
+        <w:tabs>
+          <w:tab w:val="num" w:pos="2160"/>
+        </w:tabs>
+        <w:ind w:left="2160" w:hanging="360"/>
+      </w:pPr>
+      <w:rPr>
+        <w:rFonts w:ascii="Wingdings" w:hAnsi="Wingdings" w:hint="default"/>
+        <w:sz w:val="20"/>
+      </w:rPr>
+    </w:lvl>
+    <w:lvl w:ilvl="3">
+      <w:start w:val="1"/>
+      <w:numFmt w:val="bullet"/>
+      <w:lvlText w:val=""/>
+      <w:lvlJc w:val="left"/>
+      <w:pPr>
+        <w:tabs>
+          <w:tab w:val="num" w:pos="2880"/>
+        </w:tabs>
+        <w:ind w:left="2880" w:hanging="360"/>
+      </w:pPr>
+      <w:rPr>
+        <w:rFonts w:ascii="Wingdings" w:hAnsi="Wingdings" w:hint="default"/>
+        <w:sz w:val="20"/>
+      </w:rPr>
+    </w:lvl>
+    <w:lvl w:ilvl="4">
+      <w:start w:val="1"/>
+      <w:numFmt w:val="bullet"/>
+      <w:lvlText w:val=""/>
+      <w:lvlJc w:val="left"/>
+      <w:pPr>
+        <w:tabs>
+          <w:tab w:val="num" w:pos="3600"/>
+        </w:tabs>
+        <w:ind w:left="3600" w:hanging="360"/>
+      </w:pPr>
+      <w:rPr>
+        <w:rFonts w:ascii="Wingdings" w:hAnsi="Wingdings" w:hint="default"/>
+        <w:sz w:val="20"/>
+      </w:rPr>
+    </w:lvl>
+    <w:lvl w:ilvl="5">
+      <w:start w:val="1"/>
+      <w:numFmt w:val="bullet"/>
+      <w:lvlText w:val=""/>
+      <w:lvlJc w:val="left"/>
+      <w:pPr>
+        <w:tabs>
+          <w:tab w:val="num" w:pos="4320"/>
+        </w:tabs>
+        <w:ind w:left="4320" w:hanging="360"/>
+      </w:pPr>
+      <w:rPr>
+        <w:rFonts w:ascii="Wingdings" w:hAnsi="Wingdings" w:hint="default"/>
+        <w:sz w:val="20"/>
+      </w:rPr>
+    </w:lvl>
+    <w:lvl w:ilvl="6">
+      <w:start w:val="1"/>
+      <w:numFmt w:val="bullet"/>
+      <w:lvlText w:val=""/>
+      <w:lvlJc w:val="left"/>
+      <w:pPr>
+        <w:tabs>
+          <w:tab w:val="num" w:pos="5040"/>
+        </w:tabs>
+        <w:ind w:left="5040" w:hanging="360"/>
+      </w:pPr>
+      <w:rPr>
+        <w:rFonts w:ascii="Wingdings" w:hAnsi="Wingdings" w:hint="default"/>
+        <w:sz w:val="20"/>
+      </w:rPr>
+    </w:lvl>
+    <w:lvl w:ilvl="7">
+      <w:start w:val="1"/>
+      <w:numFmt w:val="bullet"/>
+      <w:lvlText w:val=""/>
+      <w:lvlJc w:val="left"/>
+      <w:pPr>
+        <w:tabs>
+          <w:tab w:val="num" w:pos="5760"/>
+        </w:tabs>
+        <w:ind w:left="5760" w:hanging="360"/>
+      </w:pPr>
+      <w:rPr>
+        <w:rFonts w:ascii="Wingdings" w:hAnsi="Wingdings" w:hint="default"/>
+        <w:sz w:val="20"/>
+      </w:rPr>
+    </w:lvl>
+    <w:lvl w:ilvl="8">
+      <w:start w:val="1"/>
+      <w:numFmt w:val="bullet"/>
+      <w:lvlText w:val=""/>
+      <w:lvlJc w:val="left"/>
+      <w:pPr>
+        <w:tabs>
+          <w:tab w:val="num" w:pos="6480"/>
+        </w:tabs>
+        <w:ind w:left="6480" w:hanging="360"/>
+      </w:pPr>
+      <w:rPr>
+        <w:rFonts w:ascii="Wingdings" w:hAnsi="Wingdings" w:hint="default"/>
+        <w:sz w:val="20"/>
+      </w:rPr>
+    </w:lvl>
+  </w:abstractNum>
+  <w:abstractNum w:abstractNumId="9">
     <w:nsid w:val="1D9A4DD2"/>
     <w:multiLevelType w:val="multilevel"/>
     <w:tmpl w:val="6480F3C6"/>
@@ -13825,7 +16128,7 @@
       </w:rPr>
     </w:lvl>
   </w:abstractNum>
-  <w:abstractNum w:abstractNumId="9">
+  <w:abstractNum w:abstractNumId="10">
     <w:nsid w:val="26FF3821"/>
     <w:multiLevelType w:val="multilevel"/>
     <w:tmpl w:val="09F8DE90"/>
@@ -13974,7 +16277,7 @@
       </w:rPr>
     </w:lvl>
   </w:abstractNum>
-  <w:abstractNum w:abstractNumId="10">
+  <w:abstractNum w:abstractNumId="11">
     <w:nsid w:val="34CE0B25"/>
     <w:multiLevelType w:val="multilevel"/>
     <w:tmpl w:val="5EF2C8D4"/>
@@ -14123,7 +16426,7 @@
       </w:rPr>
     </w:lvl>
   </w:abstractNum>
-  <w:abstractNum w:abstractNumId="11">
+  <w:abstractNum w:abstractNumId="12">
     <w:nsid w:val="3F8F084C"/>
     <w:multiLevelType w:val="multilevel"/>
     <w:tmpl w:val="17EABB04"/>
@@ -14272,7 +16575,7 @@
       </w:rPr>
     </w:lvl>
   </w:abstractNum>
-  <w:abstractNum w:abstractNumId="12">
+  <w:abstractNum w:abstractNumId="13">
     <w:nsid w:val="4404000C"/>
     <w:multiLevelType w:val="multilevel"/>
     <w:tmpl w:val="0A56DDE0"/>
@@ -14421,7 +16724,7 @@
       </w:rPr>
     </w:lvl>
   </w:abstractNum>
-  <w:abstractNum w:abstractNumId="13">
+  <w:abstractNum w:abstractNumId="14">
     <w:nsid w:val="44CB4F9A"/>
     <w:multiLevelType w:val="multilevel"/>
     <w:tmpl w:val="2EBA1D0C"/>
@@ -14570,7 +16873,269 @@
       </w:rPr>
     </w:lvl>
   </w:abstractNum>
-  <w:abstractNum w:abstractNumId="14">
+  <w:abstractNum w:abstractNumId="15">
+    <w:nsid w:val="4567366C"/>
+    <w:multiLevelType w:val="multilevel"/>
+    <w:tmpl w:val="0354EB8A"/>
+    <w:lvl w:ilvl="0">
+      <w:start w:val="1"/>
+      <w:numFmt w:val="bullet"/>
+      <w:lvlText w:val=""/>
+      <w:lvlJc w:val="left"/>
+      <w:pPr>
+        <w:tabs>
+          <w:tab w:val="num" w:pos="720"/>
+        </w:tabs>
+        <w:ind w:left="720" w:hanging="360"/>
+      </w:pPr>
+      <w:rPr>
+        <w:rFonts w:ascii="Symbol" w:hAnsi="Symbol" w:hint="default"/>
+        <w:sz w:val="20"/>
+      </w:rPr>
+    </w:lvl>
+    <w:lvl w:ilvl="1" w:tentative="1">
+      <w:start w:val="1"/>
+      <w:numFmt w:val="bullet"/>
+      <w:lvlText w:val="o"/>
+      <w:lvlJc w:val="left"/>
+      <w:pPr>
+        <w:tabs>
+          <w:tab w:val="num" w:pos="1440"/>
+        </w:tabs>
+        <w:ind w:left="1440" w:hanging="360"/>
+      </w:pPr>
+      <w:rPr>
+        <w:rFonts w:ascii="Courier New" w:hAnsi="Courier New" w:hint="default"/>
+        <w:sz w:val="20"/>
+      </w:rPr>
+    </w:lvl>
+    <w:lvl w:ilvl="2" w:tentative="1">
+      <w:start w:val="1"/>
+      <w:numFmt w:val="bullet"/>
+      <w:lvlText w:val=""/>
+      <w:lvlJc w:val="left"/>
+      <w:pPr>
+        <w:tabs>
+          <w:tab w:val="num" w:pos="2160"/>
+        </w:tabs>
+        <w:ind w:left="2160" w:hanging="360"/>
+      </w:pPr>
+      <w:rPr>
+        <w:rFonts w:ascii="Wingdings" w:hAnsi="Wingdings" w:hint="default"/>
+        <w:sz w:val="20"/>
+      </w:rPr>
+    </w:lvl>
+    <w:lvl w:ilvl="3" w:tentative="1">
+      <w:start w:val="1"/>
+      <w:numFmt w:val="bullet"/>
+      <w:lvlText w:val=""/>
+      <w:lvlJc w:val="left"/>
+      <w:pPr>
+        <w:tabs>
+          <w:tab w:val="num" w:pos="2880"/>
+        </w:tabs>
+        <w:ind w:left="2880" w:hanging="360"/>
+      </w:pPr>
+      <w:rPr>
+        <w:rFonts w:ascii="Wingdings" w:hAnsi="Wingdings" w:hint="default"/>
+        <w:sz w:val="20"/>
+      </w:rPr>
+    </w:lvl>
+    <w:lvl w:ilvl="4" w:tentative="1">
+      <w:start w:val="1"/>
+      <w:numFmt w:val="bullet"/>
+      <w:lvlText w:val=""/>
+      <w:lvlJc w:val="left"/>
+      <w:pPr>
+        <w:tabs>
+          <w:tab w:val="num" w:pos="3600"/>
+        </w:tabs>
+        <w:ind w:left="3600" w:hanging="360"/>
+      </w:pPr>
+      <w:rPr>
+        <w:rFonts w:ascii="Wingdings" w:hAnsi="Wingdings" w:hint="default"/>
+        <w:sz w:val="20"/>
+      </w:rPr>
+    </w:lvl>
+    <w:lvl w:ilvl="5" w:tentative="1">
+      <w:start w:val="1"/>
+      <w:numFmt w:val="bullet"/>
+      <w:lvlText w:val=""/>
+      <w:lvlJc w:val="left"/>
+      <w:pPr>
+        <w:tabs>
+          <w:tab w:val="num" w:pos="4320"/>
+        </w:tabs>
+        <w:ind w:left="4320" w:hanging="360"/>
+      </w:pPr>
+      <w:rPr>
+        <w:rFonts w:ascii="Wingdings" w:hAnsi="Wingdings" w:hint="default"/>
+        <w:sz w:val="20"/>
+      </w:rPr>
+    </w:lvl>
+    <w:lvl w:ilvl="6" w:tentative="1">
+      <w:start w:val="1"/>
+      <w:numFmt w:val="bullet"/>
+      <w:lvlText w:val=""/>
+      <w:lvlJc w:val="left"/>
+      <w:pPr>
+        <w:tabs>
+          <w:tab w:val="num" w:pos="5040"/>
+        </w:tabs>
+        <w:ind w:left="5040" w:hanging="360"/>
+      </w:pPr>
+      <w:rPr>
+        <w:rFonts w:ascii="Wingdings" w:hAnsi="Wingdings" w:hint="default"/>
+        <w:sz w:val="20"/>
+      </w:rPr>
+    </w:lvl>
+    <w:lvl w:ilvl="7" w:tentative="1">
+      <w:start w:val="1"/>
+      <w:numFmt w:val="bullet"/>
+      <w:lvlText w:val=""/>
+      <w:lvlJc w:val="left"/>
+      <w:pPr>
+        <w:tabs>
+          <w:tab w:val="num" w:pos="5760"/>
+        </w:tabs>
+        <w:ind w:left="5760" w:hanging="360"/>
+      </w:pPr>
+      <w:rPr>
+        <w:rFonts w:ascii="Wingdings" w:hAnsi="Wingdings" w:hint="default"/>
+        <w:sz w:val="20"/>
+      </w:rPr>
+    </w:lvl>
+    <w:lvl w:ilvl="8" w:tentative="1">
+      <w:start w:val="1"/>
+      <w:numFmt w:val="bullet"/>
+      <w:lvlText w:val=""/>
+      <w:lvlJc w:val="left"/>
+      <w:pPr>
+        <w:tabs>
+          <w:tab w:val="num" w:pos="6480"/>
+        </w:tabs>
+        <w:ind w:left="6480" w:hanging="360"/>
+      </w:pPr>
+      <w:rPr>
+        <w:rFonts w:ascii="Wingdings" w:hAnsi="Wingdings" w:hint="default"/>
+        <w:sz w:val="20"/>
+      </w:rPr>
+    </w:lvl>
+  </w:abstractNum>
+  <w:abstractNum w:abstractNumId="16">
+    <w:nsid w:val="51E215A7"/>
+    <w:multiLevelType w:val="multilevel"/>
+    <w:tmpl w:val="9D5A364C"/>
+    <w:lvl w:ilvl="0">
+      <w:start w:val="1"/>
+      <w:numFmt w:val="decimal"/>
+      <w:lvlText w:val="%1."/>
+      <w:lvlJc w:val="left"/>
+      <w:pPr>
+        <w:tabs>
+          <w:tab w:val="num" w:pos="720"/>
+        </w:tabs>
+        <w:ind w:left="720" w:hanging="360"/>
+      </w:pPr>
+    </w:lvl>
+    <w:lvl w:ilvl="1">
+      <w:start w:val="1"/>
+      <w:numFmt w:val="decimal"/>
+      <w:lvlText w:val="%2."/>
+      <w:lvlJc w:val="left"/>
+      <w:pPr>
+        <w:tabs>
+          <w:tab w:val="num" w:pos="1440"/>
+        </w:tabs>
+        <w:ind w:left="1440" w:hanging="360"/>
+      </w:pPr>
+    </w:lvl>
+    <w:lvl w:ilvl="2">
+      <w:start w:val="1"/>
+      <w:numFmt w:val="decimal"/>
+      <w:lvlText w:val="%3."/>
+      <w:lvlJc w:val="left"/>
+      <w:pPr>
+        <w:tabs>
+          <w:tab w:val="num" w:pos="2160"/>
+        </w:tabs>
+        <w:ind w:left="2160" w:hanging="360"/>
+      </w:pPr>
+    </w:lvl>
+    <w:lvl w:ilvl="3">
+      <w:start w:val="1"/>
+      <w:numFmt w:val="decimal"/>
+      <w:lvlText w:val="%4."/>
+      <w:lvlJc w:val="left"/>
+      <w:pPr>
+        <w:tabs>
+          <w:tab w:val="num" w:pos="2880"/>
+        </w:tabs>
+        <w:ind w:left="2880" w:hanging="360"/>
+      </w:pPr>
+    </w:lvl>
+    <w:lvl w:ilvl="4">
+      <w:start w:val="1"/>
+      <w:numFmt w:val="decimal"/>
+      <w:lvlText w:val="%5."/>
+      <w:lvlJc w:val="left"/>
+      <w:pPr>
+        <w:tabs>
+          <w:tab w:val="num" w:pos="3600"/>
+        </w:tabs>
+        <w:ind w:left="3600" w:hanging="360"/>
+      </w:pPr>
+    </w:lvl>
+    <w:lvl w:ilvl="5">
+      <w:start w:val="1"/>
+      <w:numFmt w:val="decimal"/>
+      <w:lvlText w:val="%6."/>
+      <w:lvlJc w:val="left"/>
+      <w:pPr>
+        <w:tabs>
+          <w:tab w:val="num" w:pos="4320"/>
+        </w:tabs>
+        <w:ind w:left="4320" w:hanging="360"/>
+      </w:pPr>
+    </w:lvl>
+    <w:lvl w:ilvl="6">
+      <w:start w:val="1"/>
+      <w:numFmt w:val="decimal"/>
+      <w:lvlText w:val="%7."/>
+      <w:lvlJc w:val="left"/>
+      <w:pPr>
+        <w:tabs>
+          <w:tab w:val="num" w:pos="5040"/>
+        </w:tabs>
+        <w:ind w:left="5040" w:hanging="360"/>
+      </w:pPr>
+    </w:lvl>
+    <w:lvl w:ilvl="7">
+      <w:start w:val="1"/>
+      <w:numFmt w:val="decimal"/>
+      <w:lvlText w:val="%8."/>
+      <w:lvlJc w:val="left"/>
+      <w:pPr>
+        <w:tabs>
+          <w:tab w:val="num" w:pos="5760"/>
+        </w:tabs>
+        <w:ind w:left="5760" w:hanging="360"/>
+      </w:pPr>
+    </w:lvl>
+    <w:lvl w:ilvl="8">
+      <w:start w:val="1"/>
+      <w:numFmt w:val="decimal"/>
+      <w:lvlText w:val="%9."/>
+      <w:lvlJc w:val="left"/>
+      <w:pPr>
+        <w:tabs>
+          <w:tab w:val="num" w:pos="6480"/>
+        </w:tabs>
+        <w:ind w:left="6480" w:hanging="360"/>
+      </w:pPr>
+    </w:lvl>
+  </w:abstractNum>
+  <w:abstractNum w:abstractNumId="17">
     <w:nsid w:val="5C6B30B7"/>
     <w:multiLevelType w:val="hybridMultilevel"/>
     <w:tmpl w:val="6BE472E8"/>
@@ -14659,7 +17224,7 @@
       </w:pPr>
     </w:lvl>
   </w:abstractNum>
-  <w:abstractNum w:abstractNumId="15">
+  <w:abstractNum w:abstractNumId="18">
     <w:nsid w:val="6011360B"/>
     <w:multiLevelType w:val="multilevel"/>
     <w:tmpl w:val="1006199C"/>
@@ -14808,7 +17373,7 @@
       </w:rPr>
     </w:lvl>
   </w:abstractNum>
-  <w:abstractNum w:abstractNumId="16">
+  <w:abstractNum w:abstractNumId="19">
     <w:nsid w:val="65A82979"/>
     <w:multiLevelType w:val="multilevel"/>
     <w:tmpl w:val="84C4C4DA"/>
@@ -14957,7 +17522,7 @@
       </w:rPr>
     </w:lvl>
   </w:abstractNum>
-  <w:abstractNum w:abstractNumId="17">
+  <w:abstractNum w:abstractNumId="20">
     <w:nsid w:val="679F0817"/>
     <w:multiLevelType w:val="multilevel"/>
     <w:tmpl w:val="F42CF17C"/>
@@ -15070,7 +17635,7 @@
       </w:pPr>
     </w:lvl>
   </w:abstractNum>
-  <w:abstractNum w:abstractNumId="18">
+  <w:abstractNum w:abstractNumId="21">
     <w:nsid w:val="6876337F"/>
     <w:multiLevelType w:val="multilevel"/>
     <w:tmpl w:val="B1E08F80"/>
@@ -15219,7 +17784,7 @@
       </w:rPr>
     </w:lvl>
   </w:abstractNum>
-  <w:abstractNum w:abstractNumId="19">
+  <w:abstractNum w:abstractNumId="22">
     <w:nsid w:val="6B5279CE"/>
     <w:multiLevelType w:val="multilevel"/>
     <w:tmpl w:val="58341488"/>
@@ -15332,7 +17897,7 @@
       </w:pPr>
     </w:lvl>
   </w:abstractNum>
-  <w:abstractNum w:abstractNumId="20">
+  <w:abstractNum w:abstractNumId="23">
     <w:nsid w:val="6BD529A0"/>
     <w:multiLevelType w:val="multilevel"/>
     <w:tmpl w:val="469AEE9C"/>
@@ -15481,7 +18046,7 @@
       </w:rPr>
     </w:lvl>
   </w:abstractNum>
-  <w:abstractNum w:abstractNumId="21">
+  <w:abstractNum w:abstractNumId="24">
     <w:nsid w:val="6DCB4451"/>
     <w:multiLevelType w:val="multilevel"/>
     <w:tmpl w:val="5336B24A"/>
@@ -15630,7 +18195,7 @@
       </w:rPr>
     </w:lvl>
   </w:abstractNum>
-  <w:abstractNum w:abstractNumId="22">
+  <w:abstractNum w:abstractNumId="25">
     <w:nsid w:val="6E5F70C8"/>
     <w:multiLevelType w:val="multilevel"/>
     <w:tmpl w:val="F03AAB58"/>
@@ -15779,7 +18344,7 @@
       </w:rPr>
     </w:lvl>
   </w:abstractNum>
-  <w:abstractNum w:abstractNumId="23">
+  <w:abstractNum w:abstractNumId="26">
     <w:nsid w:val="727C5BDC"/>
     <w:multiLevelType w:val="multilevel"/>
     <w:tmpl w:val="C1A09C32"/>
@@ -15928,7 +18493,7 @@
       </w:rPr>
     </w:lvl>
   </w:abstractNum>
-  <w:abstractNum w:abstractNumId="24">
+  <w:abstractNum w:abstractNumId="27">
     <w:nsid w:val="7F5233E8"/>
     <w:multiLevelType w:val="multilevel"/>
     <w:tmpl w:val="060A1CD0"/>
@@ -16109,24 +18674,15 @@
   </w:num>
   <w:num w:numId="2">
     <w:abstractNumId w:val="4"/>
-    <w:lvlOverride w:ilvl="0"/>
-    <w:lvlOverride w:ilvl="1"/>
-    <w:lvlOverride w:ilvl="2"/>
-    <w:lvlOverride w:ilvl="3"/>
-    <w:lvlOverride w:ilvl="4"/>
-    <w:lvlOverride w:ilvl="5"/>
-    <w:lvlOverride w:ilvl="6"/>
-    <w:lvlOverride w:ilvl="7"/>
-    <w:lvlOverride w:ilvl="8"/>
   </w:num>
   <w:num w:numId="3">
-    <w:abstractNumId w:val="19"/>
+    <w:abstractNumId w:val="22"/>
   </w:num>
   <w:num w:numId="4">
-    <w:abstractNumId w:val="14"/>
+    <w:abstractNumId w:val="17"/>
   </w:num>
   <w:num w:numId="5">
-    <w:abstractNumId w:val="21"/>
+    <w:abstractNumId w:val="24"/>
   </w:num>
   <w:num w:numId="6">
     <w:abstractNumId w:val="5"/>
@@ -16135,28 +18691,10 @@
     <w:abstractNumId w:val="7"/>
   </w:num>
   <w:num w:numId="8">
-    <w:abstractNumId w:val="8"/>
-    <w:lvlOverride w:ilvl="0"/>
-    <w:lvlOverride w:ilvl="1"/>
-    <w:lvlOverride w:ilvl="2"/>
-    <w:lvlOverride w:ilvl="3"/>
-    <w:lvlOverride w:ilvl="4"/>
-    <w:lvlOverride w:ilvl="5"/>
-    <w:lvlOverride w:ilvl="6"/>
-    <w:lvlOverride w:ilvl="7"/>
-    <w:lvlOverride w:ilvl="8"/>
+    <w:abstractNumId w:val="9"/>
   </w:num>
   <w:num w:numId="9">
-    <w:abstractNumId w:val="11"/>
-    <w:lvlOverride w:ilvl="0"/>
-    <w:lvlOverride w:ilvl="1"/>
-    <w:lvlOverride w:ilvl="2"/>
-    <w:lvlOverride w:ilvl="3"/>
-    <w:lvlOverride w:ilvl="4"/>
-    <w:lvlOverride w:ilvl="5"/>
-    <w:lvlOverride w:ilvl="6"/>
-    <w:lvlOverride w:ilvl="7"/>
-    <w:lvlOverride w:ilvl="8"/>
+    <w:abstractNumId w:val="12"/>
   </w:num>
   <w:num w:numId="10">
     <w:abstractNumId w:val="3"/>
@@ -16219,19 +18757,10 @@
     </w:lvlOverride>
   </w:num>
   <w:num w:numId="12">
-    <w:abstractNumId w:val="9"/>
-    <w:lvlOverride w:ilvl="0"/>
-    <w:lvlOverride w:ilvl="1"/>
-    <w:lvlOverride w:ilvl="2"/>
-    <w:lvlOverride w:ilvl="3"/>
-    <w:lvlOverride w:ilvl="4"/>
-    <w:lvlOverride w:ilvl="5"/>
-    <w:lvlOverride w:ilvl="6"/>
-    <w:lvlOverride w:ilvl="7"/>
-    <w:lvlOverride w:ilvl="8"/>
+    <w:abstractNumId w:val="10"/>
   </w:num>
   <w:num w:numId="13">
-    <w:abstractNumId w:val="17"/>
+    <w:abstractNumId w:val="20"/>
     <w:lvlOverride w:ilvl="0">
       <w:startOverride w:val="1"/>
     </w:lvlOverride>
@@ -16264,37 +18793,82 @@
     <w:abstractNumId w:val="0"/>
   </w:num>
   <w:num w:numId="15">
-    <w:abstractNumId w:val="18"/>
+    <w:abstractNumId w:val="21"/>
   </w:num>
   <w:num w:numId="16">
-    <w:abstractNumId w:val="16"/>
+    <w:abstractNumId w:val="19"/>
   </w:num>
   <w:num w:numId="17">
-    <w:abstractNumId w:val="10"/>
+    <w:abstractNumId w:val="11"/>
   </w:num>
   <w:num w:numId="18">
-    <w:abstractNumId w:val="22"/>
+    <w:abstractNumId w:val="25"/>
   </w:num>
   <w:num w:numId="19">
-    <w:abstractNumId w:val="20"/>
+    <w:abstractNumId w:val="23"/>
   </w:num>
   <w:num w:numId="20">
-    <w:abstractNumId w:val="12"/>
+    <w:abstractNumId w:val="13"/>
   </w:num>
   <w:num w:numId="21">
-    <w:abstractNumId w:val="13"/>
+    <w:abstractNumId w:val="14"/>
   </w:num>
   <w:num w:numId="22">
     <w:abstractNumId w:val="1"/>
   </w:num>
   <w:num w:numId="23">
-    <w:abstractNumId w:val="23"/>
+    <w:abstractNumId w:val="26"/>
   </w:num>
   <w:num w:numId="24">
-    <w:abstractNumId w:val="15"/>
+    <w:abstractNumId w:val="18"/>
   </w:num>
   <w:num w:numId="25">
-    <w:abstractNumId w:val="24"/>
+    <w:abstractNumId w:val="27"/>
+  </w:num>
+  <w:num w:numId="26">
+    <w:abstractNumId w:val="16"/>
+    <w:lvlOverride w:ilvl="0">
+      <w:startOverride w:val="1"/>
+    </w:lvlOverride>
+    <w:lvlOverride w:ilvl="1">
+      <w:startOverride w:val="1"/>
+    </w:lvlOverride>
+    <w:lvlOverride w:ilvl="2">
+      <w:startOverride w:val="1"/>
+    </w:lvlOverride>
+    <w:lvlOverride w:ilvl="3">
+      <w:startOverride w:val="1"/>
+    </w:lvlOverride>
+    <w:lvlOverride w:ilvl="4">
+      <w:startOverride w:val="1"/>
+    </w:lvlOverride>
+    <w:lvlOverride w:ilvl="5">
+      <w:startOverride w:val="1"/>
+    </w:lvlOverride>
+    <w:lvlOverride w:ilvl="6">
+      <w:startOverride w:val="1"/>
+    </w:lvlOverride>
+    <w:lvlOverride w:ilvl="7">
+      <w:startOverride w:val="1"/>
+    </w:lvlOverride>
+    <w:lvlOverride w:ilvl="8">
+      <w:startOverride w:val="1"/>
+    </w:lvlOverride>
+  </w:num>
+  <w:num w:numId="27">
+    <w:abstractNumId w:val="8"/>
+    <w:lvlOverride w:ilvl="0"/>
+    <w:lvlOverride w:ilvl="1"/>
+    <w:lvlOverride w:ilvl="2"/>
+    <w:lvlOverride w:ilvl="3"/>
+    <w:lvlOverride w:ilvl="4"/>
+    <w:lvlOverride w:ilvl="5"/>
+    <w:lvlOverride w:ilvl="6"/>
+    <w:lvlOverride w:ilvl="7"/>
+    <w:lvlOverride w:ilvl="8"/>
+  </w:num>
+  <w:num w:numId="28">
+    <w:abstractNumId w:val="15"/>
   </w:num>
 </w:numbering>
 </file>
@@ -16542,6 +19116,7 @@
     <w:tblPr>
       <w:tblStyleRowBandSize w:val="1"/>
       <w:tblStyleColBandSize w:val="1"/>
+      <w:tblInd w:w="0" w:type="dxa"/>
       <w:tblBorders>
         <w:top w:val="single" w:sz="2" w:space="0" w:color="92CDDC" w:themeColor="accent5" w:themeTint="99"/>
         <w:bottom w:val="single" w:sz="2" w:space="0" w:color="92CDDC" w:themeColor="accent5" w:themeTint="99"/>
@@ -16849,6 +19424,7 @@
     <w:tblPr>
       <w:tblStyleRowBandSize w:val="1"/>
       <w:tblStyleColBandSize w:val="1"/>
+      <w:tblInd w:w="0" w:type="dxa"/>
       <w:tblBorders>
         <w:top w:val="single" w:sz="4" w:space="0" w:color="D99594" w:themeColor="accent2" w:themeTint="99"/>
         <w:left w:val="single" w:sz="4" w:space="0" w:color="D99594" w:themeColor="accent2" w:themeTint="99"/>
@@ -16934,6 +19510,7 @@
     <w:tblPr>
       <w:tblStyleRowBandSize w:val="1"/>
       <w:tblStyleColBandSize w:val="1"/>
+      <w:tblInd w:w="0" w:type="dxa"/>
       <w:tblBorders>
         <w:top w:val="single" w:sz="4" w:space="0" w:color="92CDDC" w:themeColor="accent5" w:themeTint="99"/>
         <w:left w:val="single" w:sz="4" w:space="0" w:color="92CDDC" w:themeColor="accent5" w:themeTint="99"/>
@@ -17019,6 +19596,7 @@
     <w:tblPr>
       <w:tblStyleRowBandSize w:val="1"/>
       <w:tblStyleColBandSize w:val="1"/>
+      <w:tblInd w:w="0" w:type="dxa"/>
       <w:tblBorders>
         <w:top w:val="single" w:sz="4" w:space="0" w:color="FABF8F" w:themeColor="accent6" w:themeTint="99"/>
         <w:left w:val="single" w:sz="4" w:space="0" w:color="FABF8F" w:themeColor="accent6" w:themeTint="99"/>
@@ -17336,6 +19914,7 @@
     <w:tblPr>
       <w:tblStyleRowBandSize w:val="1"/>
       <w:tblStyleColBandSize w:val="1"/>
+      <w:tblInd w:w="0" w:type="dxa"/>
       <w:tblBorders>
         <w:top w:val="single" w:sz="2" w:space="0" w:color="92CDDC" w:themeColor="accent5" w:themeTint="99"/>
         <w:bottom w:val="single" w:sz="2" w:space="0" w:color="92CDDC" w:themeColor="accent5" w:themeTint="99"/>
@@ -17643,6 +20222,7 @@
     <w:tblPr>
       <w:tblStyleRowBandSize w:val="1"/>
       <w:tblStyleColBandSize w:val="1"/>
+      <w:tblInd w:w="0" w:type="dxa"/>
       <w:tblBorders>
         <w:top w:val="single" w:sz="4" w:space="0" w:color="D99594" w:themeColor="accent2" w:themeTint="99"/>
         <w:left w:val="single" w:sz="4" w:space="0" w:color="D99594" w:themeColor="accent2" w:themeTint="99"/>
@@ -17728,6 +20308,7 @@
     <w:tblPr>
       <w:tblStyleRowBandSize w:val="1"/>
       <w:tblStyleColBandSize w:val="1"/>
+      <w:tblInd w:w="0" w:type="dxa"/>
       <w:tblBorders>
         <w:top w:val="single" w:sz="4" w:space="0" w:color="92CDDC" w:themeColor="accent5" w:themeTint="99"/>
         <w:left w:val="single" w:sz="4" w:space="0" w:color="92CDDC" w:themeColor="accent5" w:themeTint="99"/>
@@ -17813,6 +20394,7 @@
     <w:tblPr>
       <w:tblStyleRowBandSize w:val="1"/>
       <w:tblStyleColBandSize w:val="1"/>
+      <w:tblInd w:w="0" w:type="dxa"/>
       <w:tblBorders>
         <w:top w:val="single" w:sz="4" w:space="0" w:color="FABF8F" w:themeColor="accent6" w:themeTint="99"/>
         <w:left w:val="single" w:sz="4" w:space="0" w:color="FABF8F" w:themeColor="accent6" w:themeTint="99"/>

</xml_diff>